<commit_message>
Actualizacion de documento FD01 FD02 FD03 FD04
</commit_message>
<xml_diff>
--- a/FD01-EPIS-Informe de Factibilidad.docx
+++ b/FD01-EPIS-Informe de Factibilidad.docx
@@ -1912,7 +1912,7 @@
     </w:p>
     <w:sdt>
       <w:sdtPr>
-        <w:id w:val="-1521528351"/>
+        <w:id w:val="1394381719"/>
         <w:docPartObj>
           <w:docPartGallery w:val="Table of Contents"/>
           <w:docPartUnique w:val="1"/>
@@ -2607,7 +2607,7 @@
         <w:widowControl w:val="0"/>
         <w:numPr>
           <w:ilvl w:val="0"/>
-          <w:numId w:val="6"/>
+          <w:numId w:val="7"/>
         </w:numPr>
         <w:pBdr>
           <w:top w:space="0" w:sz="0" w:val="nil"/>
@@ -2665,7 +2665,7 @@
       <w:pPr>
         <w:numPr>
           <w:ilvl w:val="1"/>
-          <w:numId w:val="6"/>
+          <w:numId w:val="7"/>
         </w:numPr>
         <w:tabs>
           <w:tab w:val="left" w:leader="none" w:pos="1003"/>
@@ -2726,7 +2726,7 @@
       <w:pPr>
         <w:numPr>
           <w:ilvl w:val="1"/>
-          <w:numId w:val="6"/>
+          <w:numId w:val="7"/>
         </w:numPr>
         <w:tabs>
           <w:tab w:val="left" w:leader="none" w:pos="1003"/>
@@ -2774,7 +2774,7 @@
       <w:pPr>
         <w:numPr>
           <w:ilvl w:val="1"/>
-          <w:numId w:val="6"/>
+          <w:numId w:val="7"/>
         </w:numPr>
         <w:tabs>
           <w:tab w:val="left" w:leader="none" w:pos="1003"/>
@@ -2844,7 +2844,7 @@
       <w:pPr>
         <w:numPr>
           <w:ilvl w:val="1"/>
-          <w:numId w:val="6"/>
+          <w:numId w:val="7"/>
         </w:numPr>
         <w:tabs>
           <w:tab w:val="left" w:leader="none" w:pos="1003"/>
@@ -2870,7 +2870,7 @@
       <w:pPr>
         <w:numPr>
           <w:ilvl w:val="2"/>
-          <w:numId w:val="6"/>
+          <w:numId w:val="7"/>
         </w:numPr>
         <w:tabs>
           <w:tab w:val="left" w:leader="none" w:pos="1003"/>
@@ -2918,7 +2918,7 @@
       <w:pPr>
         <w:numPr>
           <w:ilvl w:val="2"/>
-          <w:numId w:val="6"/>
+          <w:numId w:val="7"/>
         </w:numPr>
         <w:tabs>
           <w:tab w:val="left" w:leader="none" w:pos="1003"/>
@@ -2944,7 +2944,7 @@
       <w:pPr>
         <w:numPr>
           <w:ilvl w:val="0"/>
-          <w:numId w:val="1"/>
+          <w:numId w:val="3"/>
         </w:numPr>
         <w:tabs>
           <w:tab w:val="left" w:leader="none" w:pos="1003"/>
@@ -2970,7 +2970,7 @@
       <w:pPr>
         <w:numPr>
           <w:ilvl w:val="0"/>
-          <w:numId w:val="1"/>
+          <w:numId w:val="3"/>
         </w:numPr>
         <w:tabs>
           <w:tab w:val="left" w:leader="none" w:pos="1003"/>
@@ -2996,7 +2996,7 @@
       <w:pPr>
         <w:numPr>
           <w:ilvl w:val="0"/>
-          <w:numId w:val="1"/>
+          <w:numId w:val="3"/>
         </w:numPr>
         <w:tabs>
           <w:tab w:val="left" w:leader="none" w:pos="1003"/>
@@ -3022,7 +3022,7 @@
       <w:pPr>
         <w:numPr>
           <w:ilvl w:val="0"/>
-          <w:numId w:val="1"/>
+          <w:numId w:val="3"/>
         </w:numPr>
         <w:tabs>
           <w:tab w:val="left" w:leader="none" w:pos="1003"/>
@@ -3071,7 +3071,7 @@
         <w:widowControl w:val="0"/>
         <w:numPr>
           <w:ilvl w:val="0"/>
-          <w:numId w:val="6"/>
+          <w:numId w:val="7"/>
         </w:numPr>
         <w:pBdr>
           <w:top w:space="0" w:sz="0" w:val="nil"/>
@@ -3129,7 +3129,7 @@
       <w:pPr>
         <w:numPr>
           <w:ilvl w:val="0"/>
-          <w:numId w:val="9"/>
+          <w:numId w:val="8"/>
         </w:numPr>
         <w:tabs>
           <w:tab w:val="left" w:leader="none" w:pos="1003"/>
@@ -3155,7 +3155,7 @@
       <w:pPr>
         <w:numPr>
           <w:ilvl w:val="0"/>
-          <w:numId w:val="9"/>
+          <w:numId w:val="8"/>
         </w:numPr>
         <w:tabs>
           <w:tab w:val="left" w:leader="none" w:pos="1003"/>
@@ -3181,7 +3181,7 @@
       <w:pPr>
         <w:numPr>
           <w:ilvl w:val="0"/>
-          <w:numId w:val="9"/>
+          <w:numId w:val="8"/>
         </w:numPr>
         <w:tabs>
           <w:tab w:val="left" w:leader="none" w:pos="1003"/>
@@ -3207,7 +3207,7 @@
       <w:pPr>
         <w:numPr>
           <w:ilvl w:val="0"/>
-          <w:numId w:val="9"/>
+          <w:numId w:val="8"/>
         </w:numPr>
         <w:tabs>
           <w:tab w:val="left" w:leader="none" w:pos="1003"/>
@@ -3272,7 +3272,7 @@
         <w:widowControl w:val="0"/>
         <w:numPr>
           <w:ilvl w:val="0"/>
-          <w:numId w:val="6"/>
+          <w:numId w:val="7"/>
         </w:numPr>
         <w:pBdr>
           <w:top w:space="0" w:sz="0" w:val="nil"/>
@@ -3330,7 +3330,7 @@
       <w:pPr>
         <w:numPr>
           <w:ilvl w:val="1"/>
-          <w:numId w:val="6"/>
+          <w:numId w:val="7"/>
         </w:numPr>
         <w:tabs>
           <w:tab w:val="left" w:leader="none" w:pos="1003"/>
@@ -3441,7 +3441,7 @@
       <w:pPr>
         <w:numPr>
           <w:ilvl w:val="1"/>
-          <w:numId w:val="6"/>
+          <w:numId w:val="7"/>
         </w:numPr>
         <w:tabs>
           <w:tab w:val="left" w:leader="none" w:pos="1003"/>
@@ -3468,7 +3468,7 @@
         <w:tabs>
           <w:tab w:val="left" w:leader="none" w:pos="1003"/>
         </w:tabs>
-        <w:spacing w:before="0" w:line="360" w:lineRule="auto"/>
+        <w:spacing w:line="360" w:lineRule="auto"/>
         <w:ind w:left="1440" w:firstLine="0"/>
         <w:jc w:val="both"/>
         <w:rPr>
@@ -3482,20 +3482,42 @@
           <w:szCs w:val="24"/>
           <w:rtl w:val="0"/>
         </w:rPr>
-        <w:t xml:space="preserve">Se cuenta con dos computadoras operativas para el desarrollo del sistema. Sin embargo, para garantizar un desarrollo eficiente del sistema móvil con inteligencia artificial, es recomendable disponer de al menos un equipo con mayores capacidades que permita trabajar correctamente con Android Studio, emuladores y herramientas de desarrollo sin afectar el rendimiento.</w:t>
+        <w:t xml:space="preserve">Para garantizar un desarrollo eficiente del sistema móvil con inteligencia artificial, se recomienda el siguiente perfil de equipamiento para las estaciones de trabajo:</w:t>
+      </w:r>
+    </w:p>
+    <w:p>
+      <w:pPr>
+        <w:tabs>
+          <w:tab w:val="left" w:leader="none" w:pos="1003"/>
+        </w:tabs>
+        <w:spacing w:line="360" w:lineRule="auto"/>
+        <w:ind w:left="1440" w:firstLine="0"/>
+        <w:jc w:val="both"/>
+        <w:rPr>
+          <w:sz w:val="24"/>
+          <w:szCs w:val="24"/>
+        </w:rPr>
+      </w:pPr>
+      <w:r>
+        <w:rPr>
+          <w:sz w:val="24"/>
+          <w:szCs w:val="24"/>
+          <w:rtl w:val="0"/>
+        </w:rPr>
+        <w:t xml:space="preserve">Estaciones de Trabajo (Desarrollo)</w:t>
       </w:r>
     </w:p>
     <w:p>
       <w:pPr>
         <w:numPr>
           <w:ilvl w:val="0"/>
-          <w:numId w:val="7"/>
+          <w:numId w:val="15"/>
         </w:numPr>
         <w:tabs>
           <w:tab w:val="left" w:leader="none" w:pos="1003"/>
         </w:tabs>
-        <w:spacing w:before="0" w:line="360" w:lineRule="auto"/>
-        <w:ind w:left="2125.9842519685035" w:hanging="360"/>
+        <w:spacing w:line="360" w:lineRule="auto"/>
+        <w:ind w:left="2160" w:hanging="360"/>
         <w:jc w:val="both"/>
         <w:rPr>
           <w:sz w:val="24"/>
@@ -3509,25 +3531,20 @@
           <w:szCs w:val="24"/>
           <w:rtl w:val="0"/>
         </w:rPr>
-        <w:t xml:space="preserve">Estaciones de trabajo (desarrollador del sistema)</w:t>
-      </w:r>
-      <w:r>
-        <w:rPr>
-          <w:rtl w:val="0"/>
-        </w:rPr>
+        <w:t xml:space="preserve">Procesador: AMD Ryzen 5 5600, Intel Core i5 de 11ª Gen o superior.</w:t>
       </w:r>
     </w:p>
     <w:p>
       <w:pPr>
         <w:numPr>
           <w:ilvl w:val="0"/>
-          <w:numId w:val="2"/>
+          <w:numId w:val="15"/>
         </w:numPr>
         <w:tabs>
           <w:tab w:val="left" w:leader="none" w:pos="1003"/>
         </w:tabs>
-        <w:spacing w:before="0" w:line="360" w:lineRule="auto"/>
-        <w:ind w:left="2834.645669291339" w:hanging="360"/>
+        <w:spacing w:line="360" w:lineRule="auto"/>
+        <w:ind w:left="2160" w:hanging="360"/>
         <w:jc w:val="both"/>
         <w:rPr>
           <w:sz w:val="24"/>
@@ -3541,20 +3558,20 @@
           <w:szCs w:val="24"/>
           <w:rtl w:val="0"/>
         </w:rPr>
-        <w:t xml:space="preserve">Procesador: Ryzen 5 5600 o equivalente</w:t>
+        <w:t xml:space="preserve">Memoria RAM: 16 GB (Altamente recomendado para ejecutar Android Studio, el Emulador y el indexado de búsqueda simultáneamente).</w:t>
       </w:r>
     </w:p>
     <w:p>
       <w:pPr>
         <w:numPr>
           <w:ilvl w:val="0"/>
-          <w:numId w:val="2"/>
+          <w:numId w:val="15"/>
         </w:numPr>
         <w:tabs>
           <w:tab w:val="left" w:leader="none" w:pos="1003"/>
         </w:tabs>
-        <w:spacing w:before="0" w:line="360" w:lineRule="auto"/>
-        <w:ind w:left="2834.645669291339" w:hanging="360"/>
+        <w:spacing w:line="360" w:lineRule="auto"/>
+        <w:ind w:left="2160" w:hanging="360"/>
         <w:jc w:val="both"/>
         <w:rPr>
           <w:sz w:val="24"/>
@@ -3568,20 +3585,20 @@
           <w:szCs w:val="24"/>
           <w:rtl w:val="0"/>
         </w:rPr>
-        <w:t xml:space="preserve">Memoria RAM: 8 GB mínimo (recomendado 16 GB para emuladores)</w:t>
+        <w:t xml:space="preserve">Almacenamiento: 256 GB SSD NVMe o superior (Indispensable para la velocidad de compilación de Gradle).</w:t>
       </w:r>
     </w:p>
     <w:p>
       <w:pPr>
         <w:numPr>
           <w:ilvl w:val="0"/>
-          <w:numId w:val="2"/>
+          <w:numId w:val="15"/>
         </w:numPr>
         <w:tabs>
           <w:tab w:val="left" w:leader="none" w:pos="1003"/>
         </w:tabs>
-        <w:spacing w:before="0" w:line="360" w:lineRule="auto"/>
-        <w:ind w:left="2834.645669291339" w:hanging="360"/>
+        <w:spacing w:line="360" w:lineRule="auto"/>
+        <w:ind w:left="2160" w:hanging="360"/>
         <w:jc w:val="both"/>
         <w:rPr>
           <w:sz w:val="24"/>
@@ -3595,20 +3612,20 @@
           <w:szCs w:val="24"/>
           <w:rtl w:val="0"/>
         </w:rPr>
-        <w:t xml:space="preserve">Almacenamiento: 256 GB SSD o superior</w:t>
+        <w:t xml:space="preserve">Monitor: Resolución mínima Full HD (1920x1080) para facilitar el diseño de interfaces en el modo Preview de Compose.</w:t>
       </w:r>
     </w:p>
     <w:p>
       <w:pPr>
         <w:numPr>
           <w:ilvl w:val="0"/>
-          <w:numId w:val="2"/>
+          <w:numId w:val="15"/>
         </w:numPr>
         <w:tabs>
           <w:tab w:val="left" w:leader="none" w:pos="1003"/>
         </w:tabs>
-        <w:spacing w:before="0" w:line="360" w:lineRule="auto"/>
-        <w:ind w:left="2834.645669291339" w:hanging="360"/>
+        <w:spacing w:line="360" w:lineRule="auto"/>
+        <w:ind w:left="2160" w:hanging="360"/>
         <w:jc w:val="both"/>
         <w:rPr>
           <w:sz w:val="24"/>
@@ -3622,20 +3639,20 @@
           <w:szCs w:val="24"/>
           <w:rtl w:val="0"/>
         </w:rPr>
-        <w:t xml:space="preserve">Monitor: Resolución mínima 1366x768</w:t>
+        <w:t xml:space="preserve">Conectividad: Internet de banda ancha estable para la integración con Firebase y la descarga de dependencias de Maven.</w:t>
       </w:r>
     </w:p>
     <w:p>
       <w:pPr>
         <w:numPr>
           <w:ilvl w:val="0"/>
-          <w:numId w:val="2"/>
+          <w:numId w:val="15"/>
         </w:numPr>
         <w:tabs>
           <w:tab w:val="left" w:leader="none" w:pos="1003"/>
         </w:tabs>
-        <w:spacing w:before="0" w:line="360" w:lineRule="auto"/>
-        <w:ind w:left="2834.645669291339" w:hanging="360"/>
+        <w:spacing w:line="360" w:lineRule="auto"/>
+        <w:ind w:left="2160" w:hanging="360"/>
         <w:jc w:val="both"/>
         <w:rPr>
           <w:sz w:val="24"/>
@@ -3649,305 +3666,29 @@
           <w:szCs w:val="24"/>
           <w:rtl w:val="0"/>
         </w:rPr>
-        <w:t xml:space="preserve">Conectividad: Internet estable para pruebas e integración de servicios externos</w:t>
-      </w:r>
-    </w:p>
-    <w:p>
-      <w:pPr>
-        <w:tabs>
-          <w:tab w:val="left" w:leader="none" w:pos="1003"/>
-        </w:tabs>
-        <w:spacing w:before="0" w:line="360" w:lineRule="auto"/>
-        <w:ind w:left="1417.3228346456694" w:hanging="7.322834645669332"/>
-        <w:jc w:val="both"/>
-        <w:rPr>
-          <w:sz w:val="24"/>
-          <w:szCs w:val="24"/>
-        </w:rPr>
-      </w:pPr>
-      <w:r>
-        <w:rPr>
-          <w:sz w:val="24"/>
-          <w:szCs w:val="24"/>
-          <w:rtl w:val="0"/>
-        </w:rPr>
-        <w:t xml:space="preserve">Del lado del sistemas es necesario:</w:t>
-      </w:r>
-    </w:p>
-    <w:p>
-      <w:pPr>
-        <w:tabs>
-          <w:tab w:val="left" w:leader="none" w:pos="1003"/>
-        </w:tabs>
-        <w:spacing w:before="0" w:line="360" w:lineRule="auto"/>
-        <w:ind w:left="1700.7874015748032" w:firstLine="0"/>
-        <w:jc w:val="both"/>
-        <w:rPr>
-          <w:sz w:val="24"/>
-          <w:szCs w:val="24"/>
-        </w:rPr>
-      </w:pPr>
-      <w:r>
-        <w:rPr>
-          <w:sz w:val="24"/>
-          <w:szCs w:val="24"/>
-          <w:rtl w:val="0"/>
-        </w:rPr>
-        <w:t xml:space="preserve">a. Lado del servidor (Backend y Base de datos)</w:t>
-      </w:r>
-    </w:p>
-    <w:p>
-      <w:pPr>
-        <w:numPr>
-          <w:ilvl w:val="0"/>
-          <w:numId w:val="13"/>
-        </w:numPr>
-        <w:tabs>
-          <w:tab w:val="left" w:leader="none" w:pos="1003"/>
-        </w:tabs>
-        <w:spacing w:before="0" w:line="360" w:lineRule="auto"/>
-        <w:ind w:left="2834.645669291339" w:hanging="360"/>
-        <w:jc w:val="both"/>
-        <w:rPr>
-          <w:sz w:val="24"/>
-          <w:szCs w:val="24"/>
-          <w:u w:val="none"/>
-        </w:rPr>
-      </w:pPr>
-      <w:r>
-        <w:rPr>
-          <w:sz w:val="24"/>
-          <w:szCs w:val="24"/>
-          <w:rtl w:val="0"/>
-        </w:rPr>
-        <w:t xml:space="preserve">Lenguaje de programación: Kotlin o Java (para consumo de APIs)</w:t>
-      </w:r>
-    </w:p>
-    <w:p>
-      <w:pPr>
-        <w:numPr>
-          <w:ilvl w:val="0"/>
-          <w:numId w:val="13"/>
-        </w:numPr>
-        <w:tabs>
-          <w:tab w:val="left" w:leader="none" w:pos="1003"/>
-        </w:tabs>
-        <w:spacing w:before="0" w:line="360" w:lineRule="auto"/>
-        <w:ind w:left="2834.645669291339" w:hanging="360"/>
-        <w:jc w:val="both"/>
-        <w:rPr>
-          <w:sz w:val="24"/>
-          <w:szCs w:val="24"/>
-          <w:u w:val="none"/>
-        </w:rPr>
-      </w:pPr>
-      <w:r>
-        <w:rPr>
-          <w:sz w:val="24"/>
-          <w:szCs w:val="24"/>
-          <w:rtl w:val="0"/>
-        </w:rPr>
-        <w:t xml:space="preserve">Servicios backend: Firebase (Authentication, Firestore o Realtime Database) o API REST</w:t>
-      </w:r>
-    </w:p>
-    <w:p>
-      <w:pPr>
-        <w:numPr>
-          <w:ilvl w:val="0"/>
-          <w:numId w:val="13"/>
-        </w:numPr>
-        <w:tabs>
-          <w:tab w:val="left" w:leader="none" w:pos="1003"/>
-        </w:tabs>
-        <w:spacing w:before="0" w:line="360" w:lineRule="auto"/>
-        <w:ind w:left="2834.645669291339" w:hanging="360"/>
-        <w:jc w:val="both"/>
-        <w:rPr>
-          <w:sz w:val="24"/>
-          <w:szCs w:val="24"/>
-          <w:u w:val="none"/>
-        </w:rPr>
-      </w:pPr>
-      <w:r>
-        <w:rPr>
-          <w:sz w:val="24"/>
-          <w:szCs w:val="24"/>
-          <w:rtl w:val="0"/>
-        </w:rPr>
-        <w:t xml:space="preserve">Base de datos: Firebase Firestore o base de datos en la nube</w:t>
-      </w:r>
-    </w:p>
-    <w:p>
-      <w:pPr>
-        <w:numPr>
-          <w:ilvl w:val="0"/>
-          <w:numId w:val="13"/>
-        </w:numPr>
-        <w:tabs>
-          <w:tab w:val="left" w:leader="none" w:pos="1003"/>
-        </w:tabs>
-        <w:spacing w:before="0" w:line="360" w:lineRule="auto"/>
-        <w:ind w:left="2834.645669291339" w:hanging="360"/>
-        <w:jc w:val="both"/>
-        <w:rPr>
-          <w:sz w:val="24"/>
-          <w:szCs w:val="24"/>
-          <w:u w:val="none"/>
-        </w:rPr>
-      </w:pPr>
-      <w:r>
-        <w:rPr>
-          <w:sz w:val="24"/>
-          <w:szCs w:val="24"/>
-          <w:rtl w:val="0"/>
-        </w:rPr>
-        <w:t xml:space="preserve">Entorno de desarrollo: Android Studio (para integración y consumo de servicios)</w:t>
-      </w:r>
-    </w:p>
-    <w:p>
-      <w:pPr>
-        <w:numPr>
-          <w:ilvl w:val="0"/>
-          <w:numId w:val="13"/>
-        </w:numPr>
-        <w:tabs>
-          <w:tab w:val="left" w:leader="none" w:pos="1003"/>
-        </w:tabs>
-        <w:spacing w:before="0" w:line="360" w:lineRule="auto"/>
-        <w:ind w:left="2834.645669291339" w:hanging="360"/>
-        <w:jc w:val="both"/>
-        <w:rPr>
-          <w:sz w:val="24"/>
-          <w:szCs w:val="24"/>
-          <w:u w:val="none"/>
-        </w:rPr>
-      </w:pPr>
-      <w:r>
-        <w:rPr>
-          <w:sz w:val="24"/>
-          <w:szCs w:val="24"/>
-          <w:rtl w:val="0"/>
-        </w:rPr>
-        <w:t xml:space="preserve">Sistema operativo del servidor: Servicios en la nube (Firebase o similares)</w:t>
-      </w:r>
-    </w:p>
-    <w:p>
-      <w:pPr>
-        <w:numPr>
-          <w:ilvl w:val="0"/>
-          <w:numId w:val="13"/>
-        </w:numPr>
-        <w:tabs>
-          <w:tab w:val="left" w:leader="none" w:pos="1003"/>
-        </w:tabs>
-        <w:spacing w:before="0" w:line="360" w:lineRule="auto"/>
-        <w:ind w:left="2834.645669291339" w:hanging="360"/>
-        <w:jc w:val="both"/>
-        <w:rPr>
-          <w:sz w:val="24"/>
-          <w:szCs w:val="24"/>
-          <w:u w:val="none"/>
-        </w:rPr>
-      </w:pPr>
-      <w:r>
-        <w:rPr>
-          <w:sz w:val="24"/>
-          <w:szCs w:val="24"/>
-          <w:rtl w:val="0"/>
-        </w:rPr>
-        <w:t xml:space="preserve">Notificaciones: Firebase Cloud Messaging</w:t>
-      </w:r>
-    </w:p>
-    <w:p>
-      <w:pPr>
-        <w:numPr>
-          <w:ilvl w:val="0"/>
-          <w:numId w:val="13"/>
-        </w:numPr>
-        <w:tabs>
-          <w:tab w:val="left" w:leader="none" w:pos="1003"/>
-        </w:tabs>
-        <w:spacing w:before="0" w:line="360" w:lineRule="auto"/>
-        <w:ind w:left="2834.645669291339" w:hanging="360"/>
-        <w:jc w:val="both"/>
-        <w:rPr>
-          <w:sz w:val="24"/>
-          <w:szCs w:val="24"/>
-          <w:u w:val="none"/>
-        </w:rPr>
-      </w:pPr>
-      <w:r>
-        <w:rPr>
-          <w:sz w:val="24"/>
-          <w:szCs w:val="24"/>
-          <w:rtl w:val="0"/>
-        </w:rPr>
-        <w:t xml:space="preserve">Inteligencia artificial IA: API de inteligencia artificial (como </w:t>
-      </w:r>
-      <w:r>
-        <w:rPr>
-          <w:sz w:val="24"/>
-          <w:szCs w:val="24"/>
-          <w:rtl w:val="0"/>
-        </w:rPr>
-        <w:t xml:space="preserve">OpenAI</w:t>
-      </w:r>
-      <w:r>
-        <w:rPr>
-          <w:sz w:val="24"/>
-          <w:szCs w:val="24"/>
-          <w:rtl w:val="0"/>
-        </w:rPr>
-        <w:t xml:space="preserve"> u otro servicio NLP)</w:t>
-      </w:r>
-    </w:p>
-    <w:p>
-      <w:pPr>
-        <w:numPr>
-          <w:ilvl w:val="0"/>
-          <w:numId w:val="13"/>
-        </w:numPr>
-        <w:tabs>
-          <w:tab w:val="left" w:leader="none" w:pos="1003"/>
-        </w:tabs>
-        <w:spacing w:before="0" w:line="360" w:lineRule="auto"/>
-        <w:ind w:left="2834.645669291339" w:hanging="360"/>
-        <w:jc w:val="both"/>
-        <w:rPr>
-          <w:sz w:val="24"/>
-          <w:szCs w:val="24"/>
-          <w:u w:val="none"/>
-        </w:rPr>
-      </w:pPr>
-      <w:r>
-        <w:rPr>
-          <w:sz w:val="24"/>
-          <w:szCs w:val="24"/>
-          <w:rtl w:val="0"/>
-        </w:rPr>
-        <w:t xml:space="preserve">Traductor: API de Google </w:t>
-      </w:r>
-    </w:p>
-    <w:p>
-      <w:pPr>
-        <w:tabs>
-          <w:tab w:val="left" w:leader="none" w:pos="1003"/>
-        </w:tabs>
-        <w:spacing w:before="0" w:line="360" w:lineRule="auto"/>
-        <w:ind w:left="1700.7874015748032" w:firstLine="0"/>
-        <w:jc w:val="both"/>
-        <w:rPr>
-          <w:sz w:val="24"/>
-          <w:szCs w:val="24"/>
-        </w:rPr>
-      </w:pPr>
-      <w:r>
-        <w:rPr>
-          <w:sz w:val="24"/>
-          <w:szCs w:val="24"/>
-          <w:rtl w:val="0"/>
-        </w:rPr>
-        <w:t xml:space="preserve">b. Lado del cliente (Frontend y acceso de usuario)</w:t>
+        <w:t xml:space="preserve">Especificaciones Técnicas del Sistema</w:t>
+      </w:r>
+    </w:p>
+    <w:p>
+      <w:pPr>
+        <w:tabs>
+          <w:tab w:val="left" w:leader="none" w:pos="1003"/>
+        </w:tabs>
+        <w:spacing w:line="360" w:lineRule="auto"/>
+        <w:ind w:left="1440" w:firstLine="0"/>
+        <w:jc w:val="both"/>
+        <w:rPr>
+          <w:sz w:val="24"/>
+          <w:szCs w:val="24"/>
+        </w:rPr>
+      </w:pPr>
+      <w:r>
+        <w:rPr>
+          <w:sz w:val="24"/>
+          <w:szCs w:val="24"/>
+          <w:rtl w:val="0"/>
+        </w:rPr>
+        <w:t xml:space="preserve">a. Lado del Servidor (Backend y Servicios en la Nube)</w:t>
       </w:r>
     </w:p>
     <w:p>
@@ -3959,8 +3700,8 @@
         <w:tabs>
           <w:tab w:val="left" w:leader="none" w:pos="1003"/>
         </w:tabs>
-        <w:spacing w:before="0" w:line="360" w:lineRule="auto"/>
-        <w:ind w:left="2692.9133858267714" w:hanging="285"/>
+        <w:spacing w:line="360" w:lineRule="auto"/>
+        <w:ind w:left="2160" w:hanging="360"/>
         <w:jc w:val="both"/>
         <w:rPr>
           <w:sz w:val="24"/>
@@ -3974,7 +3715,7 @@
           <w:szCs w:val="24"/>
           <w:rtl w:val="0"/>
         </w:rPr>
-        <w:t xml:space="preserve">Plataforma: Android</w:t>
+        <w:t xml:space="preserve">Infraestructura: Firebase (BaaS) como plataforma integral.</w:t>
       </w:r>
     </w:p>
     <w:p>
@@ -3986,8 +3727,8 @@
         <w:tabs>
           <w:tab w:val="left" w:leader="none" w:pos="1003"/>
         </w:tabs>
-        <w:spacing w:before="0" w:line="360" w:lineRule="auto"/>
-        <w:ind w:left="2692.9133858267714" w:hanging="285"/>
+        <w:spacing w:line="360" w:lineRule="auto"/>
+        <w:ind w:left="2160" w:hanging="360"/>
         <w:jc w:val="both"/>
         <w:rPr>
           <w:sz w:val="24"/>
@@ -4001,7 +3742,7 @@
           <w:szCs w:val="24"/>
           <w:rtl w:val="0"/>
         </w:rPr>
-        <w:t xml:space="preserve">Lenguaje de programación: Kotlin</w:t>
+        <w:t xml:space="preserve">Autenticación: Firebase Auth integrado con Google ID (Credential Manager API) para un inicio de sesión seguro y moderno.</w:t>
       </w:r>
     </w:p>
     <w:p>
@@ -4013,8 +3754,8 @@
         <w:tabs>
           <w:tab w:val="left" w:leader="none" w:pos="1003"/>
         </w:tabs>
-        <w:spacing w:before="0" w:line="360" w:lineRule="auto"/>
-        <w:ind w:left="2692.9133858267714" w:hanging="285"/>
+        <w:spacing w:line="360" w:lineRule="auto"/>
+        <w:ind w:left="2160" w:hanging="360"/>
         <w:jc w:val="both"/>
         <w:rPr>
           <w:sz w:val="24"/>
@@ -4028,7 +3769,7 @@
           <w:szCs w:val="24"/>
           <w:rtl w:val="0"/>
         </w:rPr>
-        <w:t xml:space="preserve">Entorno de desarrollo: Android Studio</w:t>
+        <w:t xml:space="preserve">Base de Datos: Firebase Firestore (Base de datos NoSQL orientada a documentos para almacenamiento de progreso y temas).</w:t>
       </w:r>
     </w:p>
     <w:p>
@@ -4040,8 +3781,8 @@
         <w:tabs>
           <w:tab w:val="left" w:leader="none" w:pos="1003"/>
         </w:tabs>
-        <w:spacing w:before="0" w:line="360" w:lineRule="auto"/>
-        <w:ind w:left="2692.9133858267714" w:hanging="285"/>
+        <w:spacing w:line="360" w:lineRule="auto"/>
+        <w:ind w:left="2160" w:hanging="360"/>
         <w:jc w:val="both"/>
         <w:rPr>
           <w:sz w:val="24"/>
@@ -4055,7 +3796,7 @@
           <w:szCs w:val="24"/>
           <w:rtl w:val="0"/>
         </w:rPr>
-        <w:t xml:space="preserve">Arquitectura: MVVM (Model View ViewModel)</w:t>
+        <w:t xml:space="preserve">Lógica de Servidor: Firebase Cloud Functions (utilizado para procesamiento pesado o lógica de IA que no deba residir en el cliente).</w:t>
       </w:r>
     </w:p>
     <w:p>
@@ -4067,8 +3808,8 @@
         <w:tabs>
           <w:tab w:val="left" w:leader="none" w:pos="1003"/>
         </w:tabs>
-        <w:spacing w:before="0" w:line="360" w:lineRule="auto"/>
-        <w:ind w:left="2692.9133858267714" w:hanging="285"/>
+        <w:spacing w:line="360" w:lineRule="auto"/>
+        <w:ind w:left="2160" w:hanging="360"/>
         <w:jc w:val="both"/>
         <w:rPr>
           <w:sz w:val="24"/>
@@ -4082,7 +3823,7 @@
           <w:szCs w:val="24"/>
           <w:rtl w:val="0"/>
         </w:rPr>
-        <w:t xml:space="preserve">Interfaz de usuario: Jetpack Compose</w:t>
+        <w:t xml:space="preserve">Inteligencia Artificial (IA): Integración con servicios de NLP (como la API de Gemini o OpenAI) consumidos mediante Firebase Functions o Repositorios dedicados.</w:t>
       </w:r>
     </w:p>
     <w:p>
@@ -4094,8 +3835,8 @@
         <w:tabs>
           <w:tab w:val="left" w:leader="none" w:pos="1003"/>
         </w:tabs>
-        <w:spacing w:before="0" w:line="360" w:lineRule="auto"/>
-        <w:ind w:left="2692.9133858267714" w:hanging="285"/>
+        <w:spacing w:line="360" w:lineRule="auto"/>
+        <w:ind w:left="2160" w:hanging="360"/>
         <w:jc w:val="both"/>
         <w:rPr>
           <w:sz w:val="24"/>
@@ -4109,43 +3850,281 @@
           <w:szCs w:val="24"/>
           <w:rtl w:val="0"/>
         </w:rPr>
-        <w:t xml:space="preserve">Compatibilidad: Dispositivos Android versión 8.0 o superior</w:t>
+        <w:t xml:space="preserve">Gestión de Medios: Carga de imágenes optimizada mediante Coil 3 con soporte para protocolos de red modernos.</w:t>
+      </w:r>
+    </w:p>
+    <w:p>
+      <w:pPr>
+        <w:tabs>
+          <w:tab w:val="left" w:leader="none" w:pos="1003"/>
+        </w:tabs>
+        <w:spacing w:line="360" w:lineRule="auto"/>
+        <w:ind w:left="1440" w:firstLine="0"/>
+        <w:jc w:val="both"/>
+        <w:rPr>
+          <w:sz w:val="24"/>
+          <w:szCs w:val="24"/>
+        </w:rPr>
+      </w:pPr>
+      <w:r>
+        <w:rPr>
+          <w:sz w:val="24"/>
+          <w:szCs w:val="24"/>
+          <w:rtl w:val="0"/>
+        </w:rPr>
+        <w:t xml:space="preserve">b. Lado del Cliente (Frontend Móvil)</w:t>
       </w:r>
     </w:p>
     <w:p>
       <w:pPr>
         <w:numPr>
           <w:ilvl w:val="0"/>
-          <w:numId w:val="14"/>
+          <w:numId w:val="1"/>
         </w:numPr>
         <w:tabs>
           <w:tab w:val="left" w:leader="none" w:pos="1003"/>
         </w:tabs>
+        <w:spacing w:line="360" w:lineRule="auto"/>
+        <w:ind w:left="2160" w:hanging="360"/>
+        <w:jc w:val="both"/>
+        <w:rPr>
+          <w:sz w:val="24"/>
+          <w:szCs w:val="24"/>
+          <w:u w:val="none"/>
+        </w:rPr>
+      </w:pPr>
+      <w:r>
+        <w:rPr>
+          <w:sz w:val="24"/>
+          <w:szCs w:val="24"/>
+          <w:rtl w:val="0"/>
+        </w:rPr>
+        <w:t xml:space="preserve">Plataforma: Android Nativo.</w:t>
+      </w:r>
+    </w:p>
+    <w:p>
+      <w:pPr>
+        <w:numPr>
+          <w:ilvl w:val="0"/>
+          <w:numId w:val="1"/>
+        </w:numPr>
+        <w:tabs>
+          <w:tab w:val="left" w:leader="none" w:pos="1003"/>
+        </w:tabs>
+        <w:spacing w:line="360" w:lineRule="auto"/>
+        <w:ind w:left="2160" w:hanging="360"/>
+        <w:jc w:val="both"/>
+        <w:rPr>
+          <w:sz w:val="24"/>
+          <w:szCs w:val="24"/>
+          <w:u w:val="none"/>
+        </w:rPr>
+      </w:pPr>
+      <w:r>
+        <w:rPr>
+          <w:sz w:val="24"/>
+          <w:szCs w:val="24"/>
+          <w:rtl w:val="0"/>
+        </w:rPr>
+        <w:t xml:space="preserve">Lenguaje de Programación: Kotlin (versión 1.9+).</w:t>
+      </w:r>
+    </w:p>
+    <w:p>
+      <w:pPr>
+        <w:numPr>
+          <w:ilvl w:val="0"/>
+          <w:numId w:val="1"/>
+        </w:numPr>
+        <w:tabs>
+          <w:tab w:val="left" w:leader="none" w:pos="1003"/>
+        </w:tabs>
+        <w:spacing w:line="360" w:lineRule="auto"/>
+        <w:ind w:left="2160" w:hanging="360"/>
+        <w:jc w:val="both"/>
+        <w:rPr>
+          <w:sz w:val="24"/>
+          <w:szCs w:val="24"/>
+          <w:u w:val="none"/>
+        </w:rPr>
+      </w:pPr>
+      <w:r>
+        <w:rPr>
+          <w:sz w:val="24"/>
+          <w:szCs w:val="24"/>
+          <w:rtl w:val="0"/>
+        </w:rPr>
+        <w:t xml:space="preserve">Entorno de Desarrollo: Android Studio Panda 2.</w:t>
+      </w:r>
+    </w:p>
+    <w:p>
+      <w:pPr>
+        <w:numPr>
+          <w:ilvl w:val="0"/>
+          <w:numId w:val="1"/>
+        </w:numPr>
+        <w:tabs>
+          <w:tab w:val="left" w:leader="none" w:pos="1003"/>
+        </w:tabs>
+        <w:spacing w:line="360" w:lineRule="auto"/>
+        <w:ind w:left="2160" w:hanging="360"/>
+        <w:jc w:val="both"/>
+        <w:rPr>
+          <w:sz w:val="24"/>
+          <w:szCs w:val="24"/>
+          <w:u w:val="none"/>
+        </w:rPr>
+      </w:pPr>
+      <w:r>
+        <w:rPr>
+          <w:sz w:val="24"/>
+          <w:szCs w:val="24"/>
+          <w:rtl w:val="0"/>
+        </w:rPr>
+        <w:t xml:space="preserve">Arquitectura: MVVM (Model-View-ViewModel) con flujo de datos unidireccional (UDF).</w:t>
+      </w:r>
+    </w:p>
+    <w:p>
+      <w:pPr>
+        <w:numPr>
+          <w:ilvl w:val="0"/>
+          <w:numId w:val="1"/>
+        </w:numPr>
+        <w:tabs>
+          <w:tab w:val="left" w:leader="none" w:pos="1003"/>
+        </w:tabs>
+        <w:spacing w:line="360" w:lineRule="auto"/>
+        <w:ind w:left="2160" w:hanging="360"/>
+        <w:jc w:val="both"/>
+        <w:rPr>
+          <w:sz w:val="24"/>
+          <w:szCs w:val="24"/>
+          <w:u w:val="none"/>
+        </w:rPr>
+      </w:pPr>
+      <w:r>
+        <w:rPr>
+          <w:sz w:val="24"/>
+          <w:szCs w:val="24"/>
+          <w:rtl w:val="0"/>
+        </w:rPr>
+        <w:t xml:space="preserve">Interfaz de Usuario: Jetpack Compose (Diseño declarativo moderno).</w:t>
+      </w:r>
+    </w:p>
+    <w:p>
+      <w:pPr>
+        <w:numPr>
+          <w:ilvl w:val="0"/>
+          <w:numId w:val="1"/>
+        </w:numPr>
+        <w:tabs>
+          <w:tab w:val="left" w:leader="none" w:pos="1003"/>
+        </w:tabs>
+        <w:spacing w:line="360" w:lineRule="auto"/>
+        <w:ind w:left="2160" w:hanging="360"/>
+        <w:jc w:val="both"/>
+        <w:rPr>
+          <w:sz w:val="24"/>
+          <w:szCs w:val="24"/>
+          <w:u w:val="none"/>
+        </w:rPr>
+      </w:pPr>
+      <w:r>
+        <w:rPr>
+          <w:sz w:val="24"/>
+          <w:szCs w:val="24"/>
+          <w:rtl w:val="0"/>
+        </w:rPr>
+        <w:t xml:space="preserve">Navegación: Navigation Compose utilizando rutas dinámicas y paso de argumentos.</w:t>
+      </w:r>
+    </w:p>
+    <w:p>
+      <w:pPr>
+        <w:numPr>
+          <w:ilvl w:val="0"/>
+          <w:numId w:val="1"/>
+        </w:numPr>
+        <w:tabs>
+          <w:tab w:val="left" w:leader="none" w:pos="1003"/>
+        </w:tabs>
+        <w:spacing w:line="360" w:lineRule="auto"/>
+        <w:ind w:left="2160" w:hanging="360"/>
+        <w:jc w:val="both"/>
+        <w:rPr>
+          <w:sz w:val="24"/>
+          <w:szCs w:val="24"/>
+          <w:u w:val="none"/>
+        </w:rPr>
+      </w:pPr>
+      <w:r>
+        <w:rPr>
+          <w:sz w:val="24"/>
+          <w:szCs w:val="24"/>
+          <w:rtl w:val="0"/>
+        </w:rPr>
+        <w:t xml:space="preserve">Gestión de Estado: StateFlow y MutableStateFlow para una reactividad robusta en la UI.</w:t>
+      </w:r>
+    </w:p>
+    <w:p>
+      <w:pPr>
+        <w:numPr>
+          <w:ilvl w:val="0"/>
+          <w:numId w:val="1"/>
+        </w:numPr>
+        <w:tabs>
+          <w:tab w:val="left" w:leader="none" w:pos="1003"/>
+        </w:tabs>
+        <w:spacing w:line="360" w:lineRule="auto"/>
+        <w:ind w:left="2160" w:hanging="360"/>
+        <w:jc w:val="both"/>
+        <w:rPr>
+          <w:sz w:val="24"/>
+          <w:szCs w:val="24"/>
+          <w:u w:val="none"/>
+        </w:rPr>
+      </w:pPr>
+      <w:r>
+        <w:rPr>
+          <w:sz w:val="24"/>
+          <w:szCs w:val="24"/>
+          <w:rtl w:val="0"/>
+        </w:rPr>
+        <w:t xml:space="preserve">Compatibilidad: Dispositivos Android con API 24 (Android 7.0) o superior (ajustado para soportar Credential Manager de forma eficiente).</w:t>
+      </w:r>
+    </w:p>
+    <w:p>
+      <w:pPr>
+        <w:numPr>
+          <w:ilvl w:val="0"/>
+          <w:numId w:val="1"/>
+        </w:numPr>
+        <w:tabs>
+          <w:tab w:val="left" w:leader="none" w:pos="1003"/>
+        </w:tabs>
+        <w:spacing w:line="360" w:lineRule="auto"/>
+        <w:ind w:left="2160" w:hanging="360"/>
+        <w:jc w:val="both"/>
+        <w:rPr>
+          <w:sz w:val="24"/>
+          <w:szCs w:val="24"/>
+          <w:u w:val="none"/>
+        </w:rPr>
+      </w:pPr>
+      <w:r>
+        <w:rPr>
+          <w:sz w:val="24"/>
+          <w:szCs w:val="24"/>
+          <w:rtl w:val="0"/>
+        </w:rPr>
+        <w:t xml:space="preserve">Conectividad: Requerida para autenticación, sincronización con Firestore y consultas al chat de IA.</w:t>
+      </w:r>
+    </w:p>
+    <w:p>
+      <w:pPr>
+        <w:tabs>
+          <w:tab w:val="left" w:leader="none" w:pos="1003"/>
+        </w:tabs>
         <w:spacing w:before="0" w:line="360" w:lineRule="auto"/>
-        <w:ind w:left="2692.9133858267714" w:hanging="285"/>
-        <w:jc w:val="both"/>
-        <w:rPr>
-          <w:sz w:val="24"/>
-          <w:szCs w:val="24"/>
-          <w:u w:val="none"/>
-        </w:rPr>
-      </w:pPr>
-      <w:r>
-        <w:rPr>
-          <w:sz w:val="24"/>
-          <w:szCs w:val="24"/>
-          <w:rtl w:val="0"/>
-        </w:rPr>
-        <w:t xml:space="preserve">Conectividad: Acceso a internet para funcionalidades.</w:t>
-      </w:r>
-    </w:p>
-    <w:p>
-      <w:pPr>
-        <w:tabs>
-          <w:tab w:val="left" w:leader="none" w:pos="1003"/>
-        </w:tabs>
-        <w:spacing w:before="0" w:line="360" w:lineRule="auto"/>
-        <w:ind w:left="0" w:firstLine="0"/>
+        <w:ind w:left="1440" w:firstLine="0"/>
         <w:jc w:val="both"/>
         <w:rPr>
           <w:sz w:val="24"/>
@@ -4166,7 +4145,7 @@
         <w:widowControl w:val="0"/>
         <w:numPr>
           <w:ilvl w:val="0"/>
-          <w:numId w:val="6"/>
+          <w:numId w:val="7"/>
         </w:numPr>
         <w:pBdr>
           <w:top w:space="0" w:sz="0" w:val="nil"/>
@@ -4228,7 +4207,7 @@
         <w:widowControl w:val="0"/>
         <w:numPr>
           <w:ilvl w:val="1"/>
-          <w:numId w:val="6"/>
+          <w:numId w:val="7"/>
         </w:numPr>
         <w:pBdr>
           <w:top w:space="0" w:sz="0" w:val="nil"/>
@@ -4287,7 +4266,7 @@
         <w:tabs>
           <w:tab w:val="left" w:leader="none" w:pos="1003"/>
         </w:tabs>
-        <w:spacing w:before="0" w:line="360" w:lineRule="auto"/>
+        <w:spacing w:line="360" w:lineRule="auto"/>
         <w:ind w:left="1440" w:firstLine="0"/>
         <w:jc w:val="both"/>
         <w:rPr>
@@ -4301,19 +4280,41 @@
           <w:szCs w:val="24"/>
           <w:rtl w:val="0"/>
         </w:rPr>
-        <w:t xml:space="preserve">Actualmente se cuenta con dos computadoras operativas para el desarrollo del sistema móvil con inteligencia artificial orientado al aprendizaje de quechua y aimara, es recomendable disponer de al menos un equipo adicional o mejorar las capacidades del equipo existente, considerando que el uso de Android Studio y emuladores requiere mayores recursos de procesamiento y memoria.</w:t>
+        <w:t xml:space="preserve">Para el desarrollo y despliegue del sistema móvil con inteligencia artificial orientado al aprendizaje de las lenguas Quechua y Aimara, se han definido los siguientes lineamientos de infraestructura:</w:t>
+      </w:r>
+    </w:p>
+    <w:p>
+      <w:pPr>
+        <w:tabs>
+          <w:tab w:val="left" w:leader="none" w:pos="1003"/>
+        </w:tabs>
+        <w:spacing w:line="360" w:lineRule="auto"/>
+        <w:ind w:left="1440" w:firstLine="0"/>
+        <w:jc w:val="both"/>
+        <w:rPr>
+          <w:sz w:val="24"/>
+          <w:szCs w:val="24"/>
+        </w:rPr>
+      </w:pPr>
+      <w:r>
+        <w:rPr>
+          <w:sz w:val="24"/>
+          <w:szCs w:val="24"/>
+          <w:rtl w:val="0"/>
+        </w:rPr>
+        <w:t xml:space="preserve">Equipos de Desarrollo (Estaciones de Trabajo): Se dispone de estaciones de trabajo equipadas con procesadores AMD Ryzen 5 5600 (o equivalentes de alto rendimiento). Para garantizar la fluidez en el ciclo de desarrollo (Build-Run-Debug) con Android Studio Ladybug, se ha estandarizado una memoria RAM de 16 GB y almacenamiento SSD de 256 GB o superior. Esta configuración es crítica para ejecutar simultáneamente el entorno de desarrollo, emuladores de dispositivos Android y el renderizado en tiempo real de Jetpack Compose Previews.</w:t>
       </w:r>
     </w:p>
     <w:p>
       <w:pPr>
         <w:numPr>
           <w:ilvl w:val="0"/>
-          <w:numId w:val="8"/>
+          <w:numId w:val="2"/>
         </w:numPr>
         <w:tabs>
           <w:tab w:val="left" w:leader="none" w:pos="1003"/>
         </w:tabs>
-        <w:spacing w:before="0" w:line="360" w:lineRule="auto"/>
+        <w:spacing w:line="360" w:lineRule="auto"/>
         <w:ind w:left="2160" w:hanging="360"/>
         <w:jc w:val="both"/>
         <w:rPr>
@@ -4328,24 +4329,19 @@
           <w:szCs w:val="24"/>
           <w:rtl w:val="0"/>
         </w:rPr>
-        <w:t xml:space="preserve">Equipos de desarrollo: Computadoras con procesadores Ryzen 5 5600 o equivalente, con una memoria RAM mínima de 8 GB siendo recomendable 16 GB para el uso fluido de emuladores, así como almacenamiento SSD de al menos 256 GB que permita una rápida compilación y ejecución de la aplicación.</w:t>
-      </w:r>
-      <w:r>
-        <w:rPr>
-          <w:rtl w:val="0"/>
-        </w:rPr>
+        <w:t xml:space="preserve">Arquitectura de Servidores (Backend as a Service - BaaS): El proyecto prescinde de servidores físicos locales, adoptando un modelo de computación en la nube mediante Firebase. Esta infraestructura gestiona de forma centralizada:</w:t>
       </w:r>
     </w:p>
     <w:p>
       <w:pPr>
         <w:numPr>
           <w:ilvl w:val="0"/>
-          <w:numId w:val="8"/>
+          <w:numId w:val="2"/>
         </w:numPr>
         <w:tabs>
           <w:tab w:val="left" w:leader="none" w:pos="1003"/>
         </w:tabs>
-        <w:spacing w:before="0" w:line="360" w:lineRule="auto"/>
+        <w:spacing w:line="360" w:lineRule="auto"/>
         <w:ind w:left="2160" w:hanging="360"/>
         <w:jc w:val="both"/>
         <w:rPr>
@@ -4360,24 +4356,19 @@
           <w:szCs w:val="24"/>
           <w:rtl w:val="0"/>
         </w:rPr>
-        <w:t xml:space="preserve">Servidor de pruebas: No es necesario contar con un servidor físico dedicado, ya que el sistema hará uso de servicios en la nube como Firebase para la gestión de datos, autenticación y notificaciones, lo que reduce costos de infraestructura y facilita la escalabilidad del sistema.</w:t>
-      </w:r>
-      <w:r>
-        <w:rPr>
-          <w:rtl w:val="0"/>
-        </w:rPr>
+        <w:t xml:space="preserve">Autenticación: Gestión de identidades mediante Firebase Auth y Google ID Token.</w:t>
       </w:r>
     </w:p>
     <w:p>
       <w:pPr>
         <w:numPr>
           <w:ilvl w:val="0"/>
-          <w:numId w:val="8"/>
+          <w:numId w:val="2"/>
         </w:numPr>
         <w:tabs>
           <w:tab w:val="left" w:leader="none" w:pos="1003"/>
         </w:tabs>
-        <w:spacing w:before="0" w:line="360" w:lineRule="auto"/>
+        <w:spacing w:line="360" w:lineRule="auto"/>
         <w:ind w:left="2160" w:hanging="360"/>
         <w:jc w:val="both"/>
         <w:rPr>
@@ -4392,19 +4383,19 @@
           <w:szCs w:val="24"/>
           <w:rtl w:val="0"/>
         </w:rPr>
-        <w:t xml:space="preserve">Cliente final: Dispositivos móviles con sistema operativo Android que permitan la instalación y uso de la aplicación, considerando versiones iguales o superiores a Android 8.0, con acceso a internet para el correcto funcionamiento de las funcionalidades.</w:t>
+        <w:t xml:space="preserve">Persistencia: Base de datos NoSQL Cloud Firestore para el almacenamiento escalable de temas de aprendizaje y progreso.</w:t>
       </w:r>
     </w:p>
     <w:p>
       <w:pPr>
         <w:numPr>
           <w:ilvl w:val="0"/>
-          <w:numId w:val="8"/>
+          <w:numId w:val="2"/>
         </w:numPr>
         <w:tabs>
           <w:tab w:val="left" w:leader="none" w:pos="1003"/>
         </w:tabs>
-        <w:spacing w:before="0" w:line="360" w:lineRule="auto"/>
+        <w:spacing w:line="360" w:lineRule="auto"/>
         <w:ind w:left="2160" w:hanging="360"/>
         <w:jc w:val="both"/>
         <w:rPr>
@@ -4419,12 +4410,61 @@
           <w:szCs w:val="24"/>
           <w:rtl w:val="0"/>
         </w:rPr>
-        <w:t xml:space="preserve">Compatibilidad del sistema: La aplicación será compatible con una amplia gama de dispositivos Android modernos, adaptándose a diferentes tamaños de pantalla y características de hardware mediante el uso de tecnologías como Jetpack Compose.</w:t>
-      </w:r>
-      <w:r>
-        <w:rPr>
-          <w:rtl w:val="0"/>
-        </w:rPr>
+        <w:t xml:space="preserve">Lógica de IA: Integración de procesamiento de lenguaje natural (NLP) a través de servicios externos escalables. Esto garantiza alta disponibilidad, reducción de costos operativos y una escalabilidad inmediata según la demanda de usuarios.</w:t>
+      </w:r>
+    </w:p>
+    <w:p>
+      <w:pPr>
+        <w:numPr>
+          <w:ilvl w:val="0"/>
+          <w:numId w:val="2"/>
+        </w:numPr>
+        <w:tabs>
+          <w:tab w:val="left" w:leader="none" w:pos="1003"/>
+        </w:tabs>
+        <w:spacing w:line="360" w:lineRule="auto"/>
+        <w:ind w:left="2160" w:hanging="360"/>
+        <w:jc w:val="both"/>
+        <w:rPr>
+          <w:sz w:val="24"/>
+          <w:szCs w:val="24"/>
+          <w:u w:val="none"/>
+        </w:rPr>
+      </w:pPr>
+      <w:r>
+        <w:rPr>
+          <w:sz w:val="24"/>
+          <w:szCs w:val="24"/>
+          <w:rtl w:val="0"/>
+        </w:rPr>
+        <w:t xml:space="preserve">Especificaciones del Cliente Final: La aplicación está diseñada para dispositivos móviles con sistema operativo Android (API 26 o superior / Android 8.0+). Es indispensable contar con conectividad a internet para habilitar las funciones de inteligencia artificial, sincronización de datos en tiempo real y el sistema de autenticación segura.</w:t>
+      </w:r>
+    </w:p>
+    <w:p>
+      <w:pPr>
+        <w:numPr>
+          <w:ilvl w:val="0"/>
+          <w:numId w:val="2"/>
+        </w:numPr>
+        <w:tabs>
+          <w:tab w:val="left" w:leader="none" w:pos="1003"/>
+        </w:tabs>
+        <w:spacing w:line="360" w:lineRule="auto"/>
+        <w:ind w:left="2160" w:hanging="360"/>
+        <w:jc w:val="both"/>
+        <w:rPr>
+          <w:sz w:val="24"/>
+          <w:szCs w:val="24"/>
+          <w:u w:val="none"/>
+        </w:rPr>
+      </w:pPr>
+      <w:r>
+        <w:rPr>
+          <w:sz w:val="24"/>
+          <w:szCs w:val="24"/>
+          <w:rtl w:val="0"/>
+        </w:rPr>
+        <w:t xml:space="preserve">Compatibilidad y Adaptabilidad del Sistema: Mediante el uso de Jetpack Compose y una arquitectura basada en MVVM, la interfaz de usuario es intrínsecamente adaptativa (Adaptive UI). Esto permite que la aplicación mantenga una experiencia de usuario consistente y de alto rendimiento en una amplia gama de densidades de píxeles y tamaños de pantalla, desde smartphones compactos hasta tablets modernas.</w:t>
       </w:r>
     </w:p>
     <w:p>
@@ -4454,7 +4494,7 @@
         <w:widowControl w:val="0"/>
         <w:numPr>
           <w:ilvl w:val="1"/>
-          <w:numId w:val="6"/>
+          <w:numId w:val="7"/>
         </w:numPr>
         <w:pBdr>
           <w:top w:space="0" w:sz="0" w:val="nil"/>
@@ -4512,7 +4552,7 @@
       <w:pPr>
         <w:numPr>
           <w:ilvl w:val="2"/>
-          <w:numId w:val="6"/>
+          <w:numId w:val="7"/>
         </w:numPr>
         <w:tabs>
           <w:tab w:val="left" w:leader="none" w:pos="1003"/>
@@ -4935,7 +4975,7 @@
       <w:pPr>
         <w:numPr>
           <w:ilvl w:val="2"/>
-          <w:numId w:val="6"/>
+          <w:numId w:val="7"/>
         </w:numPr>
         <w:tabs>
           <w:tab w:val="left" w:leader="none" w:pos="1003"/>
@@ -4986,7 +5026,7 @@
     <w:sdt>
       <w:sdtPr>
         <w:lock w:val="contentLocked"/>
-        <w:id w:val="-1030929516"/>
+        <w:id w:val="298957398"/>
         <w:tag w:val="goog_rdk_0"/>
       </w:sdtPr>
       <w:sdtContent>
@@ -5288,7 +5328,7 @@
       <w:pPr>
         <w:numPr>
           <w:ilvl w:val="2"/>
-          <w:numId w:val="6"/>
+          <w:numId w:val="7"/>
         </w:numPr>
         <w:tabs>
           <w:tab w:val="left" w:leader="none" w:pos="1003"/>
@@ -5313,7 +5353,7 @@
     <w:sdt>
       <w:sdtPr>
         <w:lock w:val="contentLocked"/>
-        <w:id w:val="179288308"/>
+        <w:id w:val="-2111905091"/>
         <w:tag w:val="goog_rdk_1"/>
       </w:sdtPr>
       <w:sdtContent>
@@ -5321,7 +5361,7 @@
           <w:tblPr>
             <w:tblStyle w:val="Table4"/>
             <w:tblpPr w:leftFromText="180" w:rightFromText="180" w:topFromText="180" w:bottomFromText="180" w:vertAnchor="text" w:horzAnchor="text" w:tblpX="720" w:tblpY="361.99316406249636"/>
-            <w:tblW w:w="8985.0" w:type="dxa"/>
+            <w:tblW w:w="9000.0" w:type="dxa"/>
             <w:jc w:val="left"/>
             <w:tblInd w:w="360.0" w:type="dxa"/>
             <w:tblBorders>
@@ -5336,14 +5376,16 @@
             <w:tblLook w:val="0400"/>
           </w:tblPr>
           <w:tblGrid>
-            <w:gridCol w:w="3135"/>
-            <w:gridCol w:w="2715"/>
-            <w:gridCol w:w="3135"/>
+            <w:gridCol w:w="2327.970297029703"/>
+            <w:gridCol w:w="2016.089108910891"/>
+            <w:gridCol w:w="2327.970297029703"/>
+            <w:gridCol w:w="2327.970297029703"/>
             <w:tblGridChange w:id="0">
               <w:tblGrid>
-                <w:gridCol w:w="3135"/>
-                <w:gridCol w:w="2715"/>
-                <w:gridCol w:w="3135"/>
+                <w:gridCol w:w="2327.970297029703"/>
+                <w:gridCol w:w="2016.089108910891"/>
+                <w:gridCol w:w="2327.970297029703"/>
+                <w:gridCol w:w="2327.970297029703"/>
               </w:tblGrid>
             </w:tblGridChange>
           </w:tblGrid>
@@ -5415,6 +5457,28 @@
                     <w:rtl w:val="0"/>
                   </w:rPr>
                   <w:t xml:space="preserve">Duración (3 meses)</w:t>
+                </w:r>
+              </w:p>
+            </w:tc>
+            <w:tc>
+              <w:tcPr/>
+              <w:p>
+                <w:pPr>
+                  <w:widowControl w:val="1"/>
+                  <w:spacing w:before="0" w:line="360" w:lineRule="auto"/>
+                  <w:jc w:val="both"/>
+                  <w:rPr>
+                    <w:sz w:val="24"/>
+                    <w:szCs w:val="24"/>
+                  </w:rPr>
+                </w:pPr>
+                <w:r>
+                  <w:rPr>
+                    <w:sz w:val="24"/>
+                    <w:szCs w:val="24"/>
+                    <w:rtl w:val="0"/>
+                  </w:rPr>
+                  <w:t xml:space="preserve">Justificación</w:t>
                 </w:r>
               </w:p>
             </w:tc>
@@ -5442,7 +5506,7 @@
                     <w:szCs w:val="24"/>
                     <w:rtl w:val="0"/>
                   </w:rPr>
-                  <w:t xml:space="preserve">Servicios en la nube</w:t>
+                  <w:t xml:space="preserve">Servicios en la Nube (Firebase)</w:t>
                 </w:r>
               </w:p>
             </w:tc>
@@ -5464,7 +5528,7 @@
                     <w:szCs w:val="24"/>
                     <w:rtl w:val="0"/>
                   </w:rPr>
-                  <w:t xml:space="preserve">S/. 20.00</w:t>
+                  <w:t xml:space="preserve">S/. 0.00</w:t>
                 </w:r>
               </w:p>
             </w:tc>
@@ -5486,7 +5550,29 @@
                     <w:szCs w:val="24"/>
                     <w:rtl w:val="0"/>
                   </w:rPr>
-                  <w:t xml:space="preserve">S/. 60.00</w:t>
+                  <w:t xml:space="preserve">S/. 0.00</w:t>
+                </w:r>
+              </w:p>
+            </w:tc>
+            <w:tc>
+              <w:tcPr/>
+              <w:p>
+                <w:pPr>
+                  <w:widowControl w:val="1"/>
+                  <w:spacing w:before="0" w:line="360" w:lineRule="auto"/>
+                  <w:jc w:val="both"/>
+                  <w:rPr>
+                    <w:sz w:val="24"/>
+                    <w:szCs w:val="24"/>
+                  </w:rPr>
+                </w:pPr>
+                <w:r>
+                  <w:rPr>
+                    <w:sz w:val="24"/>
+                    <w:szCs w:val="24"/>
+                    <w:rtl w:val="0"/>
+                  </w:rPr>
+                  <w:t xml:space="preserve">El Spark Plan cubre Authentication y Firestore. Las Cloud Functions (Blaze Plan) tienen 2M de llamadas gratis.</w:t>
                 </w:r>
               </w:p>
             </w:tc>
@@ -5536,7 +5622,7 @@
                     <w:szCs w:val="24"/>
                     <w:rtl w:val="0"/>
                   </w:rPr>
-                  <w:t xml:space="preserve">S/.40.00</w:t>
+                  <w:t xml:space="preserve">S/.30.00</w:t>
                 </w:r>
               </w:p>
             </w:tc>
@@ -5558,7 +5644,29 @@
                     <w:szCs w:val="24"/>
                     <w:rtl w:val="0"/>
                   </w:rPr>
-                  <w:t xml:space="preserve">S/. 120.00</w:t>
+                  <w:t xml:space="preserve">S/. 90.00</w:t>
+                </w:r>
+              </w:p>
+            </w:tc>
+            <w:tc>
+              <w:tcPr/>
+              <w:p>
+                <w:pPr>
+                  <w:widowControl w:val="1"/>
+                  <w:spacing w:before="0" w:line="360" w:lineRule="auto"/>
+                  <w:jc w:val="both"/>
+                  <w:rPr>
+                    <w:sz w:val="24"/>
+                    <w:szCs w:val="24"/>
+                  </w:rPr>
+                </w:pPr>
+                <w:r>
+                  <w:rPr>
+                    <w:sz w:val="24"/>
+                    <w:szCs w:val="24"/>
+                    <w:rtl w:val="0"/>
+                  </w:rPr>
+                  <w:t xml:space="preserve">Uso de GPT-4o-mini vía tokens. Es extremadamente económico para texto (aprox. $0.15 por cada 1M de tokens).</w:t>
                 </w:r>
               </w:p>
             </w:tc>
@@ -5586,7 +5694,7 @@
                     <w:szCs w:val="24"/>
                     <w:rtl w:val="0"/>
                   </w:rPr>
-                  <w:t xml:space="preserve">Consumo de API de traducción (Google)</w:t>
+                  <w:t xml:space="preserve">Traducción (Google Cloud)</w:t>
                 </w:r>
               </w:p>
             </w:tc>
@@ -5608,7 +5716,7 @@
                     <w:szCs w:val="24"/>
                     <w:rtl w:val="0"/>
                   </w:rPr>
-                  <w:t xml:space="preserve">S/.10.00</w:t>
+                  <w:t xml:space="preserve">S/.0.00</w:t>
                 </w:r>
               </w:p>
             </w:tc>
@@ -5630,7 +5738,29 @@
                     <w:szCs w:val="24"/>
                     <w:rtl w:val="0"/>
                   </w:rPr>
-                  <w:t xml:space="preserve">S/. 30.00</w:t>
+                  <w:t xml:space="preserve">S/. 0.00</w:t>
+                </w:r>
+              </w:p>
+            </w:tc>
+            <w:tc>
+              <w:tcPr/>
+              <w:p>
+                <w:pPr>
+                  <w:widowControl w:val="1"/>
+                  <w:spacing w:line="360" w:lineRule="auto"/>
+                  <w:jc w:val="both"/>
+                  <w:rPr>
+                    <w:sz w:val="24"/>
+                    <w:szCs w:val="24"/>
+                  </w:rPr>
+                </w:pPr>
+                <w:r>
+                  <w:rPr>
+                    <w:sz w:val="24"/>
+                    <w:szCs w:val="24"/>
+                    <w:rtl w:val="0"/>
+                  </w:rPr>
+                  <w:t xml:space="preserve">El primer medio millón (500,000) de caracteres traducidos al mes es gratuito.</w:t>
                 </w:r>
               </w:p>
             </w:tc>
@@ -5658,7 +5788,7 @@
                     <w:szCs w:val="24"/>
                     <w:rtl w:val="0"/>
                   </w:rPr>
-                  <w:t xml:space="preserve">Internet para desarrollo y pruebas</w:t>
+                  <w:t xml:space="preserve">Internet (Desarrollo/Pruebas)</w:t>
                 </w:r>
               </w:p>
             </w:tc>
@@ -5703,6 +5833,25 @@
                     <w:rtl w:val="0"/>
                   </w:rPr>
                   <w:t xml:space="preserve">S/. 150.00</w:t>
+                </w:r>
+              </w:p>
+            </w:tc>
+            <w:tc>
+              <w:tcPr/>
+              <w:p>
+                <w:pPr>
+                  <w:widowControl w:val="1"/>
+                  <w:spacing w:line="360" w:lineRule="auto"/>
+                  <w:jc w:val="both"/>
+                  <w:rPr>
+                    <w:sz w:val="24"/>
+                    <w:szCs w:val="24"/>
+                  </w:rPr>
+                </w:pPr>
+                <w:r>
+                  <w:rPr>
+                    <w:rtl w:val="0"/>
+                  </w:rPr>
                 </w:r>
               </w:p>
             </w:tc>
@@ -5778,6 +5927,25 @@
                 </w:r>
               </w:p>
             </w:tc>
+            <w:tc>
+              <w:tcPr/>
+              <w:p>
+                <w:pPr>
+                  <w:widowControl w:val="1"/>
+                  <w:spacing w:before="0" w:line="360" w:lineRule="auto"/>
+                  <w:jc w:val="both"/>
+                  <w:rPr>
+                    <w:sz w:val="24"/>
+                    <w:szCs w:val="24"/>
+                  </w:rPr>
+                </w:pPr>
+                <w:r>
+                  <w:rPr>
+                    <w:rtl w:val="0"/>
+                  </w:rPr>
+                </w:r>
+              </w:p>
+            </w:tc>
           </w:tr>
         </w:tbl>
       </w:sdtContent>
@@ -5824,7 +5992,7 @@
       <w:pPr>
         <w:numPr>
           <w:ilvl w:val="2"/>
-          <w:numId w:val="6"/>
+          <w:numId w:val="7"/>
         </w:numPr>
         <w:tabs>
           <w:tab w:val="left" w:leader="none" w:pos="1003"/>
@@ -5877,7 +6045,7 @@
     <w:sdt>
       <w:sdtPr>
         <w:lock w:val="contentLocked"/>
-        <w:id w:val="-1165625719"/>
+        <w:id w:val="-1584077790"/>
         <w:tag w:val="goog_rdk_2"/>
       </w:sdtPr>
       <w:sdtContent>
@@ -6467,7 +6635,7 @@
       <w:pPr>
         <w:numPr>
           <w:ilvl w:val="2"/>
-          <w:numId w:val="6"/>
+          <w:numId w:val="7"/>
         </w:numPr>
         <w:tabs>
           <w:tab w:val="left" w:leader="none" w:pos="1003"/>
@@ -6511,7 +6679,7 @@
     <w:sdt>
       <w:sdtPr>
         <w:lock w:val="contentLocked"/>
-        <w:id w:val="-1382699508"/>
+        <w:id w:val="-175851332"/>
         <w:tag w:val="goog_rdk_3"/>
       </w:sdtPr>
       <w:sdtContent>
@@ -7044,7 +7212,7 @@
         <w:widowControl w:val="0"/>
         <w:numPr>
           <w:ilvl w:val="1"/>
-          <w:numId w:val="6"/>
+          <w:numId w:val="7"/>
         </w:numPr>
         <w:pBdr>
           <w:top w:space="0" w:sz="0" w:val="nil"/>
@@ -7190,7 +7358,7 @@
       <w:pPr>
         <w:numPr>
           <w:ilvl w:val="0"/>
-          <w:numId w:val="10"/>
+          <w:numId w:val="9"/>
         </w:numPr>
         <w:tabs>
           <w:tab w:val="left" w:leader="none" w:pos="1003"/>
@@ -7217,7 +7385,7 @@
       <w:pPr>
         <w:numPr>
           <w:ilvl w:val="0"/>
-          <w:numId w:val="10"/>
+          <w:numId w:val="9"/>
         </w:numPr>
         <w:tabs>
           <w:tab w:val="left" w:leader="none" w:pos="1003"/>
@@ -7244,7 +7412,7 @@
       <w:pPr>
         <w:numPr>
           <w:ilvl w:val="0"/>
-          <w:numId w:val="10"/>
+          <w:numId w:val="9"/>
         </w:numPr>
         <w:tabs>
           <w:tab w:val="left" w:leader="none" w:pos="1003"/>
@@ -7271,7 +7439,7 @@
       <w:pPr>
         <w:numPr>
           <w:ilvl w:val="0"/>
-          <w:numId w:val="10"/>
+          <w:numId w:val="9"/>
         </w:numPr>
         <w:tabs>
           <w:tab w:val="left" w:leader="none" w:pos="1003"/>
@@ -7326,7 +7494,7 @@
         <w:widowControl w:val="0"/>
         <w:numPr>
           <w:ilvl w:val="1"/>
-          <w:numId w:val="6"/>
+          <w:numId w:val="7"/>
         </w:numPr>
         <w:pBdr>
           <w:top w:space="0" w:sz="0" w:val="nil"/>
@@ -7406,7 +7574,7 @@
       <w:pPr>
         <w:numPr>
           <w:ilvl w:val="0"/>
-          <w:numId w:val="12"/>
+          <w:numId w:val="11"/>
         </w:numPr>
         <w:tabs>
           <w:tab w:val="left" w:leader="none" w:pos="1274.9999999999998"/>
@@ -7610,216 +7778,6 @@
           <w:rtl w:val="0"/>
         </w:rPr>
         <w:t xml:space="preserve">Genera confianza en los usuarios al asegurar la protección de su información personal</w:t>
-      </w:r>
-    </w:p>
-    <w:p>
-      <w:pPr>
-        <w:numPr>
-          <w:ilvl w:val="0"/>
-          <w:numId w:val="4"/>
-        </w:numPr>
-        <w:tabs>
-          <w:tab w:val="left" w:leader="none" w:pos="1274.9999999999998"/>
-        </w:tabs>
-        <w:spacing w:before="0" w:line="360" w:lineRule="auto"/>
-        <w:ind w:left="1842.5196850393697" w:hanging="435"/>
-        <w:jc w:val="both"/>
-        <w:rPr>
-          <w:sz w:val="24"/>
-          <w:szCs w:val="24"/>
-        </w:rPr>
-      </w:pPr>
-      <w:r>
-        <w:rPr>
-          <w:sz w:val="24"/>
-          <w:szCs w:val="24"/>
-          <w:rtl w:val="0"/>
-        </w:rPr>
-        <w:t xml:space="preserve">Ley N° 29571 - Código de Protección y Defensa del Consumidor</w:t>
-      </w:r>
-    </w:p>
-    <w:p>
-      <w:pPr>
-        <w:tabs>
-          <w:tab w:val="left" w:leader="none" w:pos="1274.9999999999998"/>
-        </w:tabs>
-        <w:spacing w:before="0" w:line="360" w:lineRule="auto"/>
-        <w:ind w:left="1842.5196850393697" w:firstLine="0"/>
-        <w:jc w:val="both"/>
-        <w:rPr>
-          <w:sz w:val="24"/>
-          <w:szCs w:val="24"/>
-        </w:rPr>
-      </w:pPr>
-      <w:r>
-        <w:rPr>
-          <w:sz w:val="24"/>
-          <w:szCs w:val="24"/>
-          <w:rtl w:val="0"/>
-        </w:rPr>
-        <w:t xml:space="preserve">Esta ley protege los derechos de los usuarios frente a los servicios digitales, garantizando que la información brindada sea clara, veraz y accesible. En el sistema, se aplica a la forma en que se presentan los contenidos educativos y funcionalidades de la aplicación.</w:t>
-      </w:r>
-    </w:p>
-    <w:p>
-      <w:pPr>
-        <w:tabs>
-          <w:tab w:val="left" w:leader="none" w:pos="1274.9999999999998"/>
-        </w:tabs>
-        <w:spacing w:before="0" w:line="360" w:lineRule="auto"/>
-        <w:ind w:left="1842.5196850393697" w:firstLine="0"/>
-        <w:jc w:val="both"/>
-        <w:rPr>
-          <w:b w:val="1"/>
-          <w:bCs w:val="1"/>
-          <w:sz w:val="24"/>
-          <w:szCs w:val="24"/>
-        </w:rPr>
-      </w:pPr>
-      <w:r>
-        <w:rPr>
-          <w:b w:val="1"/>
-          <w:bCs w:val="1"/>
-          <w:sz w:val="24"/>
-          <w:szCs w:val="24"/>
-          <w:rtl w:val="0"/>
-        </w:rPr>
-        <w:t xml:space="preserve">Requisitos: </w:t>
-      </w:r>
-    </w:p>
-    <w:p>
-      <w:pPr>
-        <w:tabs>
-          <w:tab w:val="left" w:leader="none" w:pos="1274.9999999999998"/>
-        </w:tabs>
-        <w:spacing w:before="0" w:line="360" w:lineRule="auto"/>
-        <w:ind w:left="1842.5196850393697" w:firstLine="0"/>
-        <w:jc w:val="both"/>
-        <w:rPr>
-          <w:sz w:val="24"/>
-          <w:szCs w:val="24"/>
-        </w:rPr>
-      </w:pPr>
-      <w:r>
-        <w:rPr>
-          <w:sz w:val="24"/>
-          <w:szCs w:val="24"/>
-          <w:rtl w:val="0"/>
-        </w:rPr>
-        <w:t xml:space="preserve">El sistema debe brindar información clara sobre su funcionamiento, características y condiciones de uso</w:t>
-      </w:r>
-    </w:p>
-    <w:p>
-      <w:pPr>
-        <w:tabs>
-          <w:tab w:val="left" w:leader="none" w:pos="1274.9999999999998"/>
-        </w:tabs>
-        <w:spacing w:before="0" w:line="360" w:lineRule="auto"/>
-        <w:ind w:left="1842.5196850393697" w:firstLine="0"/>
-        <w:jc w:val="both"/>
-        <w:rPr>
-          <w:sz w:val="24"/>
-          <w:szCs w:val="24"/>
-        </w:rPr>
-      </w:pPr>
-      <w:r>
-        <w:rPr>
-          <w:sz w:val="24"/>
-          <w:szCs w:val="24"/>
-          <w:rtl w:val="0"/>
-        </w:rPr>
-        <w:t xml:space="preserve">Se debe evitar contenido engañoso o incorrecto en el proceso de enseñanza de los idiomas</w:t>
-      </w:r>
-    </w:p>
-    <w:p>
-      <w:pPr>
-        <w:tabs>
-          <w:tab w:val="left" w:leader="none" w:pos="1274.9999999999998"/>
-        </w:tabs>
-        <w:spacing w:before="0" w:line="360" w:lineRule="auto"/>
-        <w:ind w:left="1842.5196850393697" w:firstLine="0"/>
-        <w:jc w:val="both"/>
-        <w:rPr>
-          <w:sz w:val="24"/>
-          <w:szCs w:val="24"/>
-        </w:rPr>
-      </w:pPr>
-      <w:r>
-        <w:rPr>
-          <w:sz w:val="24"/>
-          <w:szCs w:val="24"/>
-          <w:rtl w:val="0"/>
-        </w:rPr>
-        <w:t xml:space="preserve">El usuario debe conocer sus derechos dentro de la aplicación</w:t>
-      </w:r>
-    </w:p>
-    <w:p>
-      <w:pPr>
-        <w:tabs>
-          <w:tab w:val="left" w:leader="none" w:pos="1003"/>
-        </w:tabs>
-        <w:spacing w:before="0" w:line="360" w:lineRule="auto"/>
-        <w:ind w:left="1842.5196850393697" w:firstLine="0"/>
-        <w:jc w:val="both"/>
-        <w:rPr>
-          <w:b w:val="1"/>
-          <w:bCs w:val="1"/>
-          <w:sz w:val="24"/>
-          <w:szCs w:val="24"/>
-        </w:rPr>
-      </w:pPr>
-      <w:r>
-        <w:rPr>
-          <w:b w:val="1"/>
-          <w:bCs w:val="1"/>
-          <w:sz w:val="24"/>
-          <w:szCs w:val="24"/>
-          <w:rtl w:val="0"/>
-        </w:rPr>
-        <w:t xml:space="preserve">Beneficios: </w:t>
-      </w:r>
-    </w:p>
-    <w:p>
-      <w:pPr>
-        <w:tabs>
-          <w:tab w:val="left" w:leader="none" w:pos="1003"/>
-        </w:tabs>
-        <w:spacing w:before="0" w:line="360" w:lineRule="auto"/>
-        <w:ind w:left="1842.5196850393697" w:firstLine="0"/>
-        <w:jc w:val="both"/>
-        <w:rPr>
-          <w:sz w:val="24"/>
-          <w:szCs w:val="24"/>
-        </w:rPr>
-      </w:pPr>
-      <w:r>
-        <w:rPr>
-          <w:sz w:val="24"/>
-          <w:szCs w:val="24"/>
-          <w:rtl w:val="0"/>
-        </w:rPr>
-        <w:t xml:space="preserve">Mejora la transparencia del sistema</w:t>
-      </w:r>
-    </w:p>
-    <w:p>
-      <w:pPr>
-        <w:tabs>
-          <w:tab w:val="left" w:leader="none" w:pos="1003"/>
-        </w:tabs>
-        <w:spacing w:before="0" w:line="360" w:lineRule="auto"/>
-        <w:ind w:left="1842.5196850393697" w:firstLine="0"/>
-        <w:jc w:val="both"/>
-        <w:rPr>
-          <w:sz w:val="24"/>
-          <w:szCs w:val="24"/>
-        </w:rPr>
-      </w:pPr>
-      <w:r>
-        <w:rPr>
-          <w:sz w:val="24"/>
-          <w:szCs w:val="24"/>
-          <w:rtl w:val="0"/>
-        </w:rPr>
-        <w:t xml:space="preserve">Fortalece la relación de confianza entre el usuario y la aplicación</w:t>
       </w:r>
     </w:p>
     <w:p>
@@ -7827,6 +7785,216 @@
         <w:numPr>
           <w:ilvl w:val="0"/>
           <w:numId w:val="5"/>
+        </w:numPr>
+        <w:tabs>
+          <w:tab w:val="left" w:leader="none" w:pos="1274.9999999999998"/>
+        </w:tabs>
+        <w:spacing w:before="0" w:line="360" w:lineRule="auto"/>
+        <w:ind w:left="1842.5196850393697" w:hanging="435"/>
+        <w:jc w:val="both"/>
+        <w:rPr>
+          <w:sz w:val="24"/>
+          <w:szCs w:val="24"/>
+        </w:rPr>
+      </w:pPr>
+      <w:r>
+        <w:rPr>
+          <w:sz w:val="24"/>
+          <w:szCs w:val="24"/>
+          <w:rtl w:val="0"/>
+        </w:rPr>
+        <w:t xml:space="preserve">Ley N° 29571 - Código de Protección y Defensa del Consumidor</w:t>
+      </w:r>
+    </w:p>
+    <w:p>
+      <w:pPr>
+        <w:tabs>
+          <w:tab w:val="left" w:leader="none" w:pos="1274.9999999999998"/>
+        </w:tabs>
+        <w:spacing w:before="0" w:line="360" w:lineRule="auto"/>
+        <w:ind w:left="1842.5196850393697" w:firstLine="0"/>
+        <w:jc w:val="both"/>
+        <w:rPr>
+          <w:sz w:val="24"/>
+          <w:szCs w:val="24"/>
+        </w:rPr>
+      </w:pPr>
+      <w:r>
+        <w:rPr>
+          <w:sz w:val="24"/>
+          <w:szCs w:val="24"/>
+          <w:rtl w:val="0"/>
+        </w:rPr>
+        <w:t xml:space="preserve">Esta ley protege los derechos de los usuarios frente a los servicios digitales, garantizando que la información brindada sea clara, veraz y accesible. En el sistema, se aplica a la forma en que se presentan los contenidos educativos y funcionalidades de la aplicación.</w:t>
+      </w:r>
+    </w:p>
+    <w:p>
+      <w:pPr>
+        <w:tabs>
+          <w:tab w:val="left" w:leader="none" w:pos="1274.9999999999998"/>
+        </w:tabs>
+        <w:spacing w:before="0" w:line="360" w:lineRule="auto"/>
+        <w:ind w:left="1842.5196850393697" w:firstLine="0"/>
+        <w:jc w:val="both"/>
+        <w:rPr>
+          <w:b w:val="1"/>
+          <w:bCs w:val="1"/>
+          <w:sz w:val="24"/>
+          <w:szCs w:val="24"/>
+        </w:rPr>
+      </w:pPr>
+      <w:r>
+        <w:rPr>
+          <w:b w:val="1"/>
+          <w:bCs w:val="1"/>
+          <w:sz w:val="24"/>
+          <w:szCs w:val="24"/>
+          <w:rtl w:val="0"/>
+        </w:rPr>
+        <w:t xml:space="preserve">Requisitos: </w:t>
+      </w:r>
+    </w:p>
+    <w:p>
+      <w:pPr>
+        <w:tabs>
+          <w:tab w:val="left" w:leader="none" w:pos="1274.9999999999998"/>
+        </w:tabs>
+        <w:spacing w:before="0" w:line="360" w:lineRule="auto"/>
+        <w:ind w:left="1842.5196850393697" w:firstLine="0"/>
+        <w:jc w:val="both"/>
+        <w:rPr>
+          <w:sz w:val="24"/>
+          <w:szCs w:val="24"/>
+        </w:rPr>
+      </w:pPr>
+      <w:r>
+        <w:rPr>
+          <w:sz w:val="24"/>
+          <w:szCs w:val="24"/>
+          <w:rtl w:val="0"/>
+        </w:rPr>
+        <w:t xml:space="preserve">El sistema debe brindar información clara sobre su funcionamiento, características y condiciones de uso</w:t>
+      </w:r>
+    </w:p>
+    <w:p>
+      <w:pPr>
+        <w:tabs>
+          <w:tab w:val="left" w:leader="none" w:pos="1274.9999999999998"/>
+        </w:tabs>
+        <w:spacing w:before="0" w:line="360" w:lineRule="auto"/>
+        <w:ind w:left="1842.5196850393697" w:firstLine="0"/>
+        <w:jc w:val="both"/>
+        <w:rPr>
+          <w:sz w:val="24"/>
+          <w:szCs w:val="24"/>
+        </w:rPr>
+      </w:pPr>
+      <w:r>
+        <w:rPr>
+          <w:sz w:val="24"/>
+          <w:szCs w:val="24"/>
+          <w:rtl w:val="0"/>
+        </w:rPr>
+        <w:t xml:space="preserve">Se debe evitar contenido engañoso o incorrecto en el proceso de enseñanza de los idiomas</w:t>
+      </w:r>
+    </w:p>
+    <w:p>
+      <w:pPr>
+        <w:tabs>
+          <w:tab w:val="left" w:leader="none" w:pos="1274.9999999999998"/>
+        </w:tabs>
+        <w:spacing w:before="0" w:line="360" w:lineRule="auto"/>
+        <w:ind w:left="1842.5196850393697" w:firstLine="0"/>
+        <w:jc w:val="both"/>
+        <w:rPr>
+          <w:sz w:val="24"/>
+          <w:szCs w:val="24"/>
+        </w:rPr>
+      </w:pPr>
+      <w:r>
+        <w:rPr>
+          <w:sz w:val="24"/>
+          <w:szCs w:val="24"/>
+          <w:rtl w:val="0"/>
+        </w:rPr>
+        <w:t xml:space="preserve">El usuario debe conocer sus derechos dentro de la aplicación</w:t>
+      </w:r>
+    </w:p>
+    <w:p>
+      <w:pPr>
+        <w:tabs>
+          <w:tab w:val="left" w:leader="none" w:pos="1003"/>
+        </w:tabs>
+        <w:spacing w:before="0" w:line="360" w:lineRule="auto"/>
+        <w:ind w:left="1842.5196850393697" w:firstLine="0"/>
+        <w:jc w:val="both"/>
+        <w:rPr>
+          <w:b w:val="1"/>
+          <w:bCs w:val="1"/>
+          <w:sz w:val="24"/>
+          <w:szCs w:val="24"/>
+        </w:rPr>
+      </w:pPr>
+      <w:r>
+        <w:rPr>
+          <w:b w:val="1"/>
+          <w:bCs w:val="1"/>
+          <w:sz w:val="24"/>
+          <w:szCs w:val="24"/>
+          <w:rtl w:val="0"/>
+        </w:rPr>
+        <w:t xml:space="preserve">Beneficios: </w:t>
+      </w:r>
+    </w:p>
+    <w:p>
+      <w:pPr>
+        <w:tabs>
+          <w:tab w:val="left" w:leader="none" w:pos="1003"/>
+        </w:tabs>
+        <w:spacing w:before="0" w:line="360" w:lineRule="auto"/>
+        <w:ind w:left="1842.5196850393697" w:firstLine="0"/>
+        <w:jc w:val="both"/>
+        <w:rPr>
+          <w:sz w:val="24"/>
+          <w:szCs w:val="24"/>
+        </w:rPr>
+      </w:pPr>
+      <w:r>
+        <w:rPr>
+          <w:sz w:val="24"/>
+          <w:szCs w:val="24"/>
+          <w:rtl w:val="0"/>
+        </w:rPr>
+        <w:t xml:space="preserve">Mejora la transparencia del sistema</w:t>
+      </w:r>
+    </w:p>
+    <w:p>
+      <w:pPr>
+        <w:tabs>
+          <w:tab w:val="left" w:leader="none" w:pos="1003"/>
+        </w:tabs>
+        <w:spacing w:before="0" w:line="360" w:lineRule="auto"/>
+        <w:ind w:left="1842.5196850393697" w:firstLine="0"/>
+        <w:jc w:val="both"/>
+        <w:rPr>
+          <w:sz w:val="24"/>
+          <w:szCs w:val="24"/>
+        </w:rPr>
+      </w:pPr>
+      <w:r>
+        <w:rPr>
+          <w:sz w:val="24"/>
+          <w:szCs w:val="24"/>
+          <w:rtl w:val="0"/>
+        </w:rPr>
+        <w:t xml:space="preserve">Fortalece la relación de confianza entre el usuario y la aplicación</w:t>
+      </w:r>
+    </w:p>
+    <w:p>
+      <w:pPr>
+        <w:numPr>
+          <w:ilvl w:val="0"/>
+          <w:numId w:val="6"/>
         </w:numPr>
         <w:tabs>
           <w:tab w:val="left" w:leader="none" w:pos="1003"/>
@@ -8041,7 +8209,7 @@
         <w:widowControl w:val="0"/>
         <w:numPr>
           <w:ilvl w:val="1"/>
-          <w:numId w:val="6"/>
+          <w:numId w:val="7"/>
         </w:numPr>
         <w:pBdr>
           <w:top w:space="0" w:sz="0" w:val="nil"/>
@@ -8099,7 +8267,7 @@
       <w:pPr>
         <w:numPr>
           <w:ilvl w:val="0"/>
-          <w:numId w:val="15"/>
+          <w:numId w:val="12"/>
         </w:numPr>
         <w:tabs>
           <w:tab w:val="left" w:leader="none" w:pos="1003"/>
@@ -8126,7 +8294,7 @@
       <w:pPr>
         <w:numPr>
           <w:ilvl w:val="0"/>
-          <w:numId w:val="15"/>
+          <w:numId w:val="12"/>
         </w:numPr>
         <w:tabs>
           <w:tab w:val="left" w:leader="none" w:pos="1003"/>
@@ -8153,7 +8321,7 @@
       <w:pPr>
         <w:numPr>
           <w:ilvl w:val="0"/>
-          <w:numId w:val="15"/>
+          <w:numId w:val="12"/>
         </w:numPr>
         <w:tabs>
           <w:tab w:val="left" w:leader="none" w:pos="1003"/>
@@ -8203,7 +8371,7 @@
         <w:widowControl w:val="0"/>
         <w:numPr>
           <w:ilvl w:val="1"/>
-          <w:numId w:val="6"/>
+          <w:numId w:val="7"/>
         </w:numPr>
         <w:pBdr>
           <w:top w:space="0" w:sz="0" w:val="nil"/>
@@ -8261,7 +8429,7 @@
       <w:pPr>
         <w:numPr>
           <w:ilvl w:val="0"/>
-          <w:numId w:val="11"/>
+          <w:numId w:val="10"/>
         </w:numPr>
         <w:tabs>
           <w:tab w:val="left" w:leader="none" w:pos="1003"/>
@@ -8293,7 +8461,7 @@
       <w:pPr>
         <w:numPr>
           <w:ilvl w:val="0"/>
-          <w:numId w:val="11"/>
+          <w:numId w:val="10"/>
         </w:numPr>
         <w:tabs>
           <w:tab w:val="left" w:leader="none" w:pos="1003"/>
@@ -8320,7 +8488,7 @@
       <w:pPr>
         <w:numPr>
           <w:ilvl w:val="0"/>
-          <w:numId w:val="11"/>
+          <w:numId w:val="10"/>
         </w:numPr>
         <w:tabs>
           <w:tab w:val="left" w:leader="none" w:pos="1003"/>
@@ -8370,7 +8538,7 @@
         <w:widowControl w:val="0"/>
         <w:numPr>
           <w:ilvl w:val="0"/>
-          <w:numId w:val="6"/>
+          <w:numId w:val="7"/>
         </w:numPr>
         <w:pBdr>
           <w:top w:space="0" w:sz="0" w:val="nil"/>
@@ -8428,7 +8596,7 @@
       <w:pPr>
         <w:numPr>
           <w:ilvl w:val="1"/>
-          <w:numId w:val="6"/>
+          <w:numId w:val="7"/>
         </w:numPr>
         <w:tabs>
           <w:tab w:val="left" w:leader="none" w:pos="1003"/>
@@ -8454,7 +8622,7 @@
       <w:pPr>
         <w:numPr>
           <w:ilvl w:val="2"/>
-          <w:numId w:val="6"/>
+          <w:numId w:val="7"/>
         </w:numPr>
         <w:tabs>
           <w:tab w:val="left" w:leader="none" w:pos="1003"/>
@@ -8502,7 +8670,7 @@
       <w:pPr>
         <w:numPr>
           <w:ilvl w:val="0"/>
-          <w:numId w:val="16"/>
+          <w:numId w:val="13"/>
         </w:numPr>
         <w:tabs>
           <w:tab w:val="left" w:leader="none" w:pos="1003"/>
@@ -8534,7 +8702,7 @@
       <w:pPr>
         <w:numPr>
           <w:ilvl w:val="0"/>
-          <w:numId w:val="16"/>
+          <w:numId w:val="13"/>
         </w:numPr>
         <w:tabs>
           <w:tab w:val="left" w:leader="none" w:pos="1003"/>
@@ -8566,7 +8734,7 @@
       <w:pPr>
         <w:numPr>
           <w:ilvl w:val="0"/>
-          <w:numId w:val="16"/>
+          <w:numId w:val="13"/>
         </w:numPr>
         <w:tabs>
           <w:tab w:val="left" w:leader="none" w:pos="1003"/>
@@ -8620,7 +8788,7 @@
       <w:pPr>
         <w:numPr>
           <w:ilvl w:val="0"/>
-          <w:numId w:val="3"/>
+          <w:numId w:val="4"/>
         </w:numPr>
         <w:tabs>
           <w:tab w:val="left" w:leader="none" w:pos="1003"/>
@@ -8647,7 +8815,7 @@
       <w:pPr>
         <w:numPr>
           <w:ilvl w:val="0"/>
-          <w:numId w:val="3"/>
+          <w:numId w:val="4"/>
         </w:numPr>
         <w:tabs>
           <w:tab w:val="left" w:leader="none" w:pos="1003"/>
@@ -8674,7 +8842,7 @@
       <w:pPr>
         <w:numPr>
           <w:ilvl w:val="0"/>
-          <w:numId w:val="3"/>
+          <w:numId w:val="4"/>
         </w:numPr>
         <w:tabs>
           <w:tab w:val="left" w:leader="none" w:pos="1003"/>
@@ -8701,7 +8869,7 @@
       <w:pPr>
         <w:numPr>
           <w:ilvl w:val="0"/>
-          <w:numId w:val="3"/>
+          <w:numId w:val="4"/>
         </w:numPr>
         <w:tabs>
           <w:tab w:val="left" w:leader="none" w:pos="1003"/>
@@ -8747,7 +8915,7 @@
       <w:pPr>
         <w:numPr>
           <w:ilvl w:val="2"/>
-          <w:numId w:val="6"/>
+          <w:numId w:val="7"/>
         </w:numPr>
         <w:tabs>
           <w:tab w:val="left" w:leader="none" w:pos="1003"/>
@@ -8773,7 +8941,7 @@
       <w:pPr>
         <w:numPr>
           <w:ilvl w:val="3"/>
-          <w:numId w:val="6"/>
+          <w:numId w:val="7"/>
         </w:numPr>
         <w:tabs>
           <w:tab w:val="left" w:leader="none" w:pos="1003"/>
@@ -8927,7 +9095,7 @@
     <w:sdt>
       <w:sdtPr>
         <w:lock w:val="contentLocked"/>
-        <w:id w:val="1545250804"/>
+        <w:id w:val="-1501410968"/>
         <w:tag w:val="goog_rdk_4"/>
       </w:sdtPr>
       <w:sdtContent>
@@ -11668,7 +11836,7 @@
       <w:pPr>
         <w:numPr>
           <w:ilvl w:val="3"/>
-          <w:numId w:val="6"/>
+          <w:numId w:val="7"/>
         </w:numPr>
         <w:tabs>
           <w:tab w:val="left" w:leader="none" w:pos="1003"/>
@@ -11735,7 +11903,7 @@
       <w:pPr>
         <w:numPr>
           <w:ilvl w:val="3"/>
-          <w:numId w:val="6"/>
+          <w:numId w:val="7"/>
         </w:numPr>
         <w:tabs>
           <w:tab w:val="left" w:leader="none" w:pos="1003"/>
@@ -11812,7 +11980,7 @@
         <w:widowControl w:val="0"/>
         <w:numPr>
           <w:ilvl w:val="0"/>
-          <w:numId w:val="6"/>
+          <w:numId w:val="7"/>
         </w:numPr>
         <w:pBdr>
           <w:top w:space="0" w:sz="0" w:val="nil"/>
@@ -12233,7 +12401,7 @@
       <w:lvlText w:val="●"/>
       <w:lvlJc w:val="left"/>
       <w:pPr>
-        <w:ind w:left="2880" w:hanging="360"/>
+        <w:ind w:left="2160" w:hanging="360"/>
       </w:pPr>
       <w:rPr>
         <w:u w:val="none"/>
@@ -12245,7 +12413,7 @@
       <w:lvlText w:val="○"/>
       <w:lvlJc w:val="left"/>
       <w:pPr>
-        <w:ind w:left="3600" w:hanging="360"/>
+        <w:ind w:left="2880" w:hanging="360"/>
       </w:pPr>
       <w:rPr>
         <w:u w:val="none"/>
@@ -12257,7 +12425,7 @@
       <w:lvlText w:val="■"/>
       <w:lvlJc w:val="left"/>
       <w:pPr>
-        <w:ind w:left="4320" w:hanging="360"/>
+        <w:ind w:left="3600" w:hanging="360"/>
       </w:pPr>
       <w:rPr>
         <w:u w:val="none"/>
@@ -12269,7 +12437,7 @@
       <w:lvlText w:val="●"/>
       <w:lvlJc w:val="left"/>
       <w:pPr>
-        <w:ind w:left="5040" w:hanging="360"/>
+        <w:ind w:left="4320" w:hanging="360"/>
       </w:pPr>
       <w:rPr>
         <w:u w:val="none"/>
@@ -12281,7 +12449,7 @@
       <w:lvlText w:val="○"/>
       <w:lvlJc w:val="left"/>
       <w:pPr>
-        <w:ind w:left="5760" w:hanging="360"/>
+        <w:ind w:left="5040" w:hanging="360"/>
       </w:pPr>
       <w:rPr>
         <w:u w:val="none"/>
@@ -12293,7 +12461,7 @@
       <w:lvlText w:val="■"/>
       <w:lvlJc w:val="left"/>
       <w:pPr>
-        <w:ind w:left="6480" w:hanging="360"/>
+        <w:ind w:left="5760" w:hanging="360"/>
       </w:pPr>
       <w:rPr>
         <w:u w:val="none"/>
@@ -12305,7 +12473,7 @@
       <w:lvlText w:val="●"/>
       <w:lvlJc w:val="left"/>
       <w:pPr>
-        <w:ind w:left="7200" w:hanging="360"/>
+        <w:ind w:left="6480" w:hanging="360"/>
       </w:pPr>
       <w:rPr>
         <w:u w:val="none"/>
@@ -12317,7 +12485,7 @@
       <w:lvlText w:val="○"/>
       <w:lvlJc w:val="left"/>
       <w:pPr>
-        <w:ind w:left="7920" w:hanging="360"/>
+        <w:ind w:left="7200" w:hanging="360"/>
       </w:pPr>
       <w:rPr>
         <w:u w:val="none"/>
@@ -12329,7 +12497,7 @@
       <w:lvlText w:val="■"/>
       <w:lvlJc w:val="left"/>
       <w:pPr>
-        <w:ind w:left="8640" w:hanging="360"/>
+        <w:ind w:left="7920" w:hanging="360"/>
       </w:pPr>
       <w:rPr>
         <w:u w:val="none"/>
@@ -12563,7 +12731,7 @@
       <w:lvlText w:val="●"/>
       <w:lvlJc w:val="left"/>
       <w:pPr>
-        <w:ind w:left="1440" w:hanging="360"/>
+        <w:ind w:left="2880" w:hanging="360"/>
       </w:pPr>
       <w:rPr>
         <w:u w:val="none"/>
@@ -12575,7 +12743,7 @@
       <w:lvlText w:val="○"/>
       <w:lvlJc w:val="left"/>
       <w:pPr>
-        <w:ind w:left="2160" w:hanging="360"/>
+        <w:ind w:left="3600" w:hanging="360"/>
       </w:pPr>
       <w:rPr>
         <w:u w:val="none"/>
@@ -12587,7 +12755,7 @@
       <w:lvlText w:val="■"/>
       <w:lvlJc w:val="left"/>
       <w:pPr>
-        <w:ind w:left="2880" w:hanging="360"/>
+        <w:ind w:left="4320" w:hanging="360"/>
       </w:pPr>
       <w:rPr>
         <w:u w:val="none"/>
@@ -12599,7 +12767,7 @@
       <w:lvlText w:val="●"/>
       <w:lvlJc w:val="left"/>
       <w:pPr>
-        <w:ind w:left="3600" w:hanging="360"/>
+        <w:ind w:left="5040" w:hanging="360"/>
       </w:pPr>
       <w:rPr>
         <w:u w:val="none"/>
@@ -12611,7 +12779,7 @@
       <w:lvlText w:val="○"/>
       <w:lvlJc w:val="left"/>
       <w:pPr>
-        <w:ind w:left="4320" w:hanging="360"/>
+        <w:ind w:left="5760" w:hanging="360"/>
       </w:pPr>
       <w:rPr>
         <w:u w:val="none"/>
@@ -12623,7 +12791,7 @@
       <w:lvlText w:val="■"/>
       <w:lvlJc w:val="left"/>
       <w:pPr>
-        <w:ind w:left="5040" w:hanging="360"/>
+        <w:ind w:left="6480" w:hanging="360"/>
       </w:pPr>
       <w:rPr>
         <w:u w:val="none"/>
@@ -12635,7 +12803,7 @@
       <w:lvlText w:val="●"/>
       <w:lvlJc w:val="left"/>
       <w:pPr>
-        <w:ind w:left="5760" w:hanging="360"/>
+        <w:ind w:left="7200" w:hanging="360"/>
       </w:pPr>
       <w:rPr>
         <w:u w:val="none"/>
@@ -12647,7 +12815,7 @@
       <w:lvlText w:val="○"/>
       <w:lvlJc w:val="left"/>
       <w:pPr>
-        <w:ind w:left="6480" w:hanging="360"/>
+        <w:ind w:left="7920" w:hanging="360"/>
       </w:pPr>
       <w:rPr>
         <w:u w:val="none"/>
@@ -12659,7 +12827,7 @@
       <w:lvlText w:val="■"/>
       <w:lvlJc w:val="left"/>
       <w:pPr>
-        <w:ind w:left="7200" w:hanging="360"/>
+        <w:ind w:left="8640" w:hanging="360"/>
       </w:pPr>
       <w:rPr>
         <w:u w:val="none"/>
@@ -12779,6 +12947,116 @@
   <w:abstractNum w:abstractNumId="6">
     <w:lvl w:ilvl="0">
       <w:start w:val="1"/>
+      <w:numFmt w:val="bullet"/>
+      <w:lvlText w:val="●"/>
+      <w:lvlJc w:val="left"/>
+      <w:pPr>
+        <w:ind w:left="1440" w:hanging="360"/>
+      </w:pPr>
+      <w:rPr>
+        <w:u w:val="none"/>
+      </w:rPr>
+    </w:lvl>
+    <w:lvl w:ilvl="1">
+      <w:start w:val="1"/>
+      <w:numFmt w:val="bullet"/>
+      <w:lvlText w:val="○"/>
+      <w:lvlJc w:val="left"/>
+      <w:pPr>
+        <w:ind w:left="2160" w:hanging="360"/>
+      </w:pPr>
+      <w:rPr>
+        <w:u w:val="none"/>
+      </w:rPr>
+    </w:lvl>
+    <w:lvl w:ilvl="2">
+      <w:start w:val="1"/>
+      <w:numFmt w:val="bullet"/>
+      <w:lvlText w:val="■"/>
+      <w:lvlJc w:val="left"/>
+      <w:pPr>
+        <w:ind w:left="2880" w:hanging="360"/>
+      </w:pPr>
+      <w:rPr>
+        <w:u w:val="none"/>
+      </w:rPr>
+    </w:lvl>
+    <w:lvl w:ilvl="3">
+      <w:start w:val="1"/>
+      <w:numFmt w:val="bullet"/>
+      <w:lvlText w:val="●"/>
+      <w:lvlJc w:val="left"/>
+      <w:pPr>
+        <w:ind w:left="3600" w:hanging="360"/>
+      </w:pPr>
+      <w:rPr>
+        <w:u w:val="none"/>
+      </w:rPr>
+    </w:lvl>
+    <w:lvl w:ilvl="4">
+      <w:start w:val="1"/>
+      <w:numFmt w:val="bullet"/>
+      <w:lvlText w:val="○"/>
+      <w:lvlJc w:val="left"/>
+      <w:pPr>
+        <w:ind w:left="4320" w:hanging="360"/>
+      </w:pPr>
+      <w:rPr>
+        <w:u w:val="none"/>
+      </w:rPr>
+    </w:lvl>
+    <w:lvl w:ilvl="5">
+      <w:start w:val="1"/>
+      <w:numFmt w:val="bullet"/>
+      <w:lvlText w:val="■"/>
+      <w:lvlJc w:val="left"/>
+      <w:pPr>
+        <w:ind w:left="5040" w:hanging="360"/>
+      </w:pPr>
+      <w:rPr>
+        <w:u w:val="none"/>
+      </w:rPr>
+    </w:lvl>
+    <w:lvl w:ilvl="6">
+      <w:start w:val="1"/>
+      <w:numFmt w:val="bullet"/>
+      <w:lvlText w:val="●"/>
+      <w:lvlJc w:val="left"/>
+      <w:pPr>
+        <w:ind w:left="5760" w:hanging="360"/>
+      </w:pPr>
+      <w:rPr>
+        <w:u w:val="none"/>
+      </w:rPr>
+    </w:lvl>
+    <w:lvl w:ilvl="7">
+      <w:start w:val="1"/>
+      <w:numFmt w:val="bullet"/>
+      <w:lvlText w:val="○"/>
+      <w:lvlJc w:val="left"/>
+      <w:pPr>
+        <w:ind w:left="6480" w:hanging="360"/>
+      </w:pPr>
+      <w:rPr>
+        <w:u w:val="none"/>
+      </w:rPr>
+    </w:lvl>
+    <w:lvl w:ilvl="8">
+      <w:start w:val="1"/>
+      <w:numFmt w:val="bullet"/>
+      <w:lvlText w:val="■"/>
+      <w:lvlJc w:val="left"/>
+      <w:pPr>
+        <w:ind w:left="7200" w:hanging="360"/>
+      </w:pPr>
+      <w:rPr>
+        <w:u w:val="none"/>
+      </w:rPr>
+    </w:lvl>
+  </w:abstractNum>
+  <w:abstractNum w:abstractNumId="7">
+    <w:lvl w:ilvl="0">
+      <w:start w:val="1"/>
       <w:numFmt w:val="decimal"/>
       <w:lvlText w:val="%1."/>
       <w:lvlJc w:val="right"/>
@@ -12880,116 +13158,6 @@
       <w:lvlJc w:val="right"/>
       <w:pPr>
         <w:ind w:left="6480" w:hanging="360"/>
-      </w:pPr>
-      <w:rPr>
-        <w:u w:val="none"/>
-      </w:rPr>
-    </w:lvl>
-  </w:abstractNum>
-  <w:abstractNum w:abstractNumId="7">
-    <w:lvl w:ilvl="0">
-      <w:start w:val="1"/>
-      <w:numFmt w:val="lowerLetter"/>
-      <w:lvlText w:val="%1."/>
-      <w:lvlJc w:val="left"/>
-      <w:pPr>
-        <w:ind w:left="1440" w:hanging="360"/>
-      </w:pPr>
-      <w:rPr>
-        <w:u w:val="none"/>
-      </w:rPr>
-    </w:lvl>
-    <w:lvl w:ilvl="1">
-      <w:start w:val="1"/>
-      <w:numFmt w:val="lowerRoman"/>
-      <w:lvlText w:val="%2."/>
-      <w:lvlJc w:val="right"/>
-      <w:pPr>
-        <w:ind w:left="2160" w:hanging="360"/>
-      </w:pPr>
-      <w:rPr>
-        <w:u w:val="none"/>
-      </w:rPr>
-    </w:lvl>
-    <w:lvl w:ilvl="2">
-      <w:start w:val="1"/>
-      <w:numFmt w:val="decimal"/>
-      <w:lvlText w:val="%3."/>
-      <w:lvlJc w:val="left"/>
-      <w:pPr>
-        <w:ind w:left="2880" w:hanging="360"/>
-      </w:pPr>
-      <w:rPr>
-        <w:u w:val="none"/>
-      </w:rPr>
-    </w:lvl>
-    <w:lvl w:ilvl="3">
-      <w:start w:val="1"/>
-      <w:numFmt w:val="lowerLetter"/>
-      <w:lvlText w:val="%4."/>
-      <w:lvlJc w:val="left"/>
-      <w:pPr>
-        <w:ind w:left="3600" w:hanging="360"/>
-      </w:pPr>
-      <w:rPr>
-        <w:u w:val="none"/>
-      </w:rPr>
-    </w:lvl>
-    <w:lvl w:ilvl="4">
-      <w:start w:val="1"/>
-      <w:numFmt w:val="lowerRoman"/>
-      <w:lvlText w:val="%5."/>
-      <w:lvlJc w:val="right"/>
-      <w:pPr>
-        <w:ind w:left="4320" w:hanging="360"/>
-      </w:pPr>
-      <w:rPr>
-        <w:u w:val="none"/>
-      </w:rPr>
-    </w:lvl>
-    <w:lvl w:ilvl="5">
-      <w:start w:val="1"/>
-      <w:numFmt w:val="decimal"/>
-      <w:lvlText w:val="%6."/>
-      <w:lvlJc w:val="left"/>
-      <w:pPr>
-        <w:ind w:left="5040" w:hanging="360"/>
-      </w:pPr>
-      <w:rPr>
-        <w:u w:val="none"/>
-      </w:rPr>
-    </w:lvl>
-    <w:lvl w:ilvl="6">
-      <w:start w:val="1"/>
-      <w:numFmt w:val="lowerLetter"/>
-      <w:lvlText w:val="%7."/>
-      <w:lvlJc w:val="left"/>
-      <w:pPr>
-        <w:ind w:left="5760" w:hanging="360"/>
-      </w:pPr>
-      <w:rPr>
-        <w:u w:val="none"/>
-      </w:rPr>
-    </w:lvl>
-    <w:lvl w:ilvl="7">
-      <w:start w:val="1"/>
-      <w:numFmt w:val="lowerRoman"/>
-      <w:lvlText w:val="%8."/>
-      <w:lvlJc w:val="right"/>
-      <w:pPr>
-        <w:ind w:left="6480" w:hanging="360"/>
-      </w:pPr>
-      <w:rPr>
-        <w:u w:val="none"/>
-      </w:rPr>
-    </w:lvl>
-    <w:lvl w:ilvl="8">
-      <w:start w:val="1"/>
-      <w:numFmt w:val="decimal"/>
-      <w:lvlText w:val="%9."/>
-      <w:lvlJc w:val="left"/>
-      <w:pPr>
-        <w:ind w:left="7200" w:hanging="360"/>
       </w:pPr>
       <w:rPr>
         <w:u w:val="none"/>
@@ -13003,7 +13171,7 @@
       <w:lvlText w:val="●"/>
       <w:lvlJc w:val="left"/>
       <w:pPr>
-        <w:ind w:left="2160" w:hanging="360"/>
+        <w:ind w:left="720" w:hanging="360"/>
       </w:pPr>
       <w:rPr>
         <w:u w:val="none"/>
@@ -13015,7 +13183,7 @@
       <w:lvlText w:val="○"/>
       <w:lvlJc w:val="left"/>
       <w:pPr>
-        <w:ind w:left="2880" w:hanging="360"/>
+        <w:ind w:left="1440" w:hanging="360"/>
       </w:pPr>
       <w:rPr>
         <w:u w:val="none"/>
@@ -13027,7 +13195,7 @@
       <w:lvlText w:val="■"/>
       <w:lvlJc w:val="left"/>
       <w:pPr>
-        <w:ind w:left="3600" w:hanging="360"/>
+        <w:ind w:left="2160" w:hanging="360"/>
       </w:pPr>
       <w:rPr>
         <w:u w:val="none"/>
@@ -13039,7 +13207,7 @@
       <w:lvlText w:val="●"/>
       <w:lvlJc w:val="left"/>
       <w:pPr>
-        <w:ind w:left="4320" w:hanging="360"/>
+        <w:ind w:left="2880" w:hanging="360"/>
       </w:pPr>
       <w:rPr>
         <w:u w:val="none"/>
@@ -13051,7 +13219,7 @@
       <w:lvlText w:val="○"/>
       <w:lvlJc w:val="left"/>
       <w:pPr>
-        <w:ind w:left="5040" w:hanging="360"/>
+        <w:ind w:left="3600" w:hanging="360"/>
       </w:pPr>
       <w:rPr>
         <w:u w:val="none"/>
@@ -13063,7 +13231,7 @@
       <w:lvlText w:val="■"/>
       <w:lvlJc w:val="left"/>
       <w:pPr>
-        <w:ind w:left="5760" w:hanging="360"/>
+        <w:ind w:left="4320" w:hanging="360"/>
       </w:pPr>
       <w:rPr>
         <w:u w:val="none"/>
@@ -13075,7 +13243,7 @@
       <w:lvlText w:val="●"/>
       <w:lvlJc w:val="left"/>
       <w:pPr>
-        <w:ind w:left="6480" w:hanging="360"/>
+        <w:ind w:left="5040" w:hanging="360"/>
       </w:pPr>
       <w:rPr>
         <w:u w:val="none"/>
@@ -13087,7 +13255,7 @@
       <w:lvlText w:val="○"/>
       <w:lvlJc w:val="left"/>
       <w:pPr>
-        <w:ind w:left="7200" w:hanging="360"/>
+        <w:ind w:left="5760" w:hanging="360"/>
       </w:pPr>
       <w:rPr>
         <w:u w:val="none"/>
@@ -13099,7 +13267,7 @@
       <w:lvlText w:val="■"/>
       <w:lvlJc w:val="left"/>
       <w:pPr>
-        <w:ind w:left="7920" w:hanging="360"/>
+        <w:ind w:left="6480" w:hanging="360"/>
       </w:pPr>
       <w:rPr>
         <w:u w:val="none"/>
@@ -13113,7 +13281,7 @@
       <w:lvlText w:val="●"/>
       <w:lvlJc w:val="left"/>
       <w:pPr>
-        <w:ind w:left="720" w:hanging="360"/>
+        <w:ind w:left="2160" w:hanging="360"/>
       </w:pPr>
       <w:rPr>
         <w:u w:val="none"/>
@@ -13125,7 +13293,7 @@
       <w:lvlText w:val="○"/>
       <w:lvlJc w:val="left"/>
       <w:pPr>
-        <w:ind w:left="1440" w:hanging="360"/>
+        <w:ind w:left="2880" w:hanging="360"/>
       </w:pPr>
       <w:rPr>
         <w:u w:val="none"/>
@@ -13137,7 +13305,7 @@
       <w:lvlText w:val="■"/>
       <w:lvlJc w:val="left"/>
       <w:pPr>
-        <w:ind w:left="2160" w:hanging="360"/>
+        <w:ind w:left="3600" w:hanging="360"/>
       </w:pPr>
       <w:rPr>
         <w:u w:val="none"/>
@@ -13149,7 +13317,7 @@
       <w:lvlText w:val="●"/>
       <w:lvlJc w:val="left"/>
       <w:pPr>
-        <w:ind w:left="2880" w:hanging="360"/>
+        <w:ind w:left="4320" w:hanging="360"/>
       </w:pPr>
       <w:rPr>
         <w:u w:val="none"/>
@@ -13161,7 +13329,7 @@
       <w:lvlText w:val="○"/>
       <w:lvlJc w:val="left"/>
       <w:pPr>
-        <w:ind w:left="3600" w:hanging="360"/>
+        <w:ind w:left="5040" w:hanging="360"/>
       </w:pPr>
       <w:rPr>
         <w:u w:val="none"/>
@@ -13173,7 +13341,7 @@
       <w:lvlText w:val="■"/>
       <w:lvlJc w:val="left"/>
       <w:pPr>
-        <w:ind w:left="4320" w:hanging="360"/>
+        <w:ind w:left="5760" w:hanging="360"/>
       </w:pPr>
       <w:rPr>
         <w:u w:val="none"/>
@@ -13185,7 +13353,7 @@
       <w:lvlText w:val="●"/>
       <w:lvlJc w:val="left"/>
       <w:pPr>
-        <w:ind w:left="5040" w:hanging="360"/>
+        <w:ind w:left="6480" w:hanging="360"/>
       </w:pPr>
       <w:rPr>
         <w:u w:val="none"/>
@@ -13197,7 +13365,7 @@
       <w:lvlText w:val="○"/>
       <w:lvlJc w:val="left"/>
       <w:pPr>
-        <w:ind w:left="5760" w:hanging="360"/>
+        <w:ind w:left="7200" w:hanging="360"/>
       </w:pPr>
       <w:rPr>
         <w:u w:val="none"/>
@@ -13209,7 +13377,7 @@
       <w:lvlText w:val="■"/>
       <w:lvlJc w:val="left"/>
       <w:pPr>
-        <w:ind w:left="6480" w:hanging="360"/>
+        <w:ind w:left="7920" w:hanging="360"/>
       </w:pPr>
       <w:rPr>
         <w:u w:val="none"/>
@@ -13223,7 +13391,7 @@
       <w:lvlText w:val="●"/>
       <w:lvlJc w:val="left"/>
       <w:pPr>
-        <w:ind w:left="2160" w:hanging="360"/>
+        <w:ind w:left="1440" w:hanging="360"/>
       </w:pPr>
       <w:rPr>
         <w:u w:val="none"/>
@@ -13235,7 +13403,7 @@
       <w:lvlText w:val="○"/>
       <w:lvlJc w:val="left"/>
       <w:pPr>
-        <w:ind w:left="2880" w:hanging="360"/>
+        <w:ind w:left="2160" w:hanging="360"/>
       </w:pPr>
       <w:rPr>
         <w:u w:val="none"/>
@@ -13247,7 +13415,7 @@
       <w:lvlText w:val="■"/>
       <w:lvlJc w:val="left"/>
       <w:pPr>
-        <w:ind w:left="3600" w:hanging="360"/>
+        <w:ind w:left="2880" w:hanging="360"/>
       </w:pPr>
       <w:rPr>
         <w:u w:val="none"/>
@@ -13259,7 +13427,7 @@
       <w:lvlText w:val="●"/>
       <w:lvlJc w:val="left"/>
       <w:pPr>
-        <w:ind w:left="4320" w:hanging="360"/>
+        <w:ind w:left="3600" w:hanging="360"/>
       </w:pPr>
       <w:rPr>
         <w:u w:val="none"/>
@@ -13271,7 +13439,7 @@
       <w:lvlText w:val="○"/>
       <w:lvlJc w:val="left"/>
       <w:pPr>
-        <w:ind w:left="5040" w:hanging="360"/>
+        <w:ind w:left="4320" w:hanging="360"/>
       </w:pPr>
       <w:rPr>
         <w:u w:val="none"/>
@@ -13283,7 +13451,7 @@
       <w:lvlText w:val="■"/>
       <w:lvlJc w:val="left"/>
       <w:pPr>
-        <w:ind w:left="5760" w:hanging="360"/>
+        <w:ind w:left="5040" w:hanging="360"/>
       </w:pPr>
       <w:rPr>
         <w:u w:val="none"/>
@@ -13295,7 +13463,7 @@
       <w:lvlText w:val="●"/>
       <w:lvlJc w:val="left"/>
       <w:pPr>
-        <w:ind w:left="6480" w:hanging="360"/>
+        <w:ind w:left="5760" w:hanging="360"/>
       </w:pPr>
       <w:rPr>
         <w:u w:val="none"/>
@@ -13307,7 +13475,7 @@
       <w:lvlText w:val="○"/>
       <w:lvlJc w:val="left"/>
       <w:pPr>
-        <w:ind w:left="7200" w:hanging="360"/>
+        <w:ind w:left="6480" w:hanging="360"/>
       </w:pPr>
       <w:rPr>
         <w:u w:val="none"/>
@@ -13319,7 +13487,7 @@
       <w:lvlText w:val="■"/>
       <w:lvlJc w:val="left"/>
       <w:pPr>
-        <w:ind w:left="7920" w:hanging="360"/>
+        <w:ind w:left="7200" w:hanging="360"/>
       </w:pPr>
       <w:rPr>
         <w:u w:val="none"/>
@@ -13553,7 +13721,7 @@
       <w:lvlText w:val="●"/>
       <w:lvlJc w:val="left"/>
       <w:pPr>
-        <w:ind w:left="2160" w:hanging="360"/>
+        <w:ind w:left="2880" w:hanging="360"/>
       </w:pPr>
       <w:rPr>
         <w:u w:val="none"/>
@@ -13565,7 +13733,7 @@
       <w:lvlText w:val="○"/>
       <w:lvlJc w:val="left"/>
       <w:pPr>
-        <w:ind w:left="2880" w:hanging="360"/>
+        <w:ind w:left="3600" w:hanging="360"/>
       </w:pPr>
       <w:rPr>
         <w:u w:val="none"/>
@@ -13577,7 +13745,7 @@
       <w:lvlText w:val="■"/>
       <w:lvlJc w:val="left"/>
       <w:pPr>
-        <w:ind w:left="3600" w:hanging="360"/>
+        <w:ind w:left="4320" w:hanging="360"/>
       </w:pPr>
       <w:rPr>
         <w:u w:val="none"/>
@@ -13589,7 +13757,7 @@
       <w:lvlText w:val="●"/>
       <w:lvlJc w:val="left"/>
       <w:pPr>
-        <w:ind w:left="4320" w:hanging="360"/>
+        <w:ind w:left="5040" w:hanging="360"/>
       </w:pPr>
       <w:rPr>
         <w:u w:val="none"/>
@@ -13601,7 +13769,7 @@
       <w:lvlText w:val="○"/>
       <w:lvlJc w:val="left"/>
       <w:pPr>
-        <w:ind w:left="5040" w:hanging="360"/>
+        <w:ind w:left="5760" w:hanging="360"/>
       </w:pPr>
       <w:rPr>
         <w:u w:val="none"/>
@@ -13613,7 +13781,7 @@
       <w:lvlText w:val="■"/>
       <w:lvlJc w:val="left"/>
       <w:pPr>
-        <w:ind w:left="5760" w:hanging="360"/>
+        <w:ind w:left="6480" w:hanging="360"/>
       </w:pPr>
       <w:rPr>
         <w:u w:val="none"/>
@@ -13625,7 +13793,7 @@
       <w:lvlText w:val="●"/>
       <w:lvlJc w:val="left"/>
       <w:pPr>
-        <w:ind w:left="6480" w:hanging="360"/>
+        <w:ind w:left="7200" w:hanging="360"/>
       </w:pPr>
       <w:rPr>
         <w:u w:val="none"/>
@@ -13637,7 +13805,7 @@
       <w:lvlText w:val="○"/>
       <w:lvlJc w:val="left"/>
       <w:pPr>
-        <w:ind w:left="7200" w:hanging="360"/>
+        <w:ind w:left="7920" w:hanging="360"/>
       </w:pPr>
       <w:rPr>
         <w:u w:val="none"/>
@@ -13649,7 +13817,7 @@
       <w:lvlText w:val="■"/>
       <w:lvlJc w:val="left"/>
       <w:pPr>
-        <w:ind w:left="7920" w:hanging="360"/>
+        <w:ind w:left="8640" w:hanging="360"/>
       </w:pPr>
       <w:rPr>
         <w:u w:val="none"/>
@@ -13773,7 +13941,7 @@
       <w:lvlText w:val="●"/>
       <w:lvlJc w:val="left"/>
       <w:pPr>
-        <w:ind w:left="1440" w:hanging="360"/>
+        <w:ind w:left="2160" w:hanging="360"/>
       </w:pPr>
       <w:rPr>
         <w:u w:val="none"/>
@@ -13785,7 +13953,7 @@
       <w:lvlText w:val="○"/>
       <w:lvlJc w:val="left"/>
       <w:pPr>
-        <w:ind w:left="2160" w:hanging="360"/>
+        <w:ind w:left="2880" w:hanging="360"/>
       </w:pPr>
       <w:rPr>
         <w:u w:val="none"/>
@@ -13797,7 +13965,7 @@
       <w:lvlText w:val="■"/>
       <w:lvlJc w:val="left"/>
       <w:pPr>
-        <w:ind w:left="2880" w:hanging="360"/>
+        <w:ind w:left="3600" w:hanging="360"/>
       </w:pPr>
       <w:rPr>
         <w:u w:val="none"/>
@@ -13809,7 +13977,7 @@
       <w:lvlText w:val="●"/>
       <w:lvlJc w:val="left"/>
       <w:pPr>
-        <w:ind w:left="3600" w:hanging="360"/>
+        <w:ind w:left="4320" w:hanging="360"/>
       </w:pPr>
       <w:rPr>
         <w:u w:val="none"/>
@@ -13821,7 +13989,7 @@
       <w:lvlText w:val="○"/>
       <w:lvlJc w:val="left"/>
       <w:pPr>
-        <w:ind w:left="4320" w:hanging="360"/>
+        <w:ind w:left="5040" w:hanging="360"/>
       </w:pPr>
       <w:rPr>
         <w:u w:val="none"/>
@@ -13833,7 +14001,7 @@
       <w:lvlText w:val="■"/>
       <w:lvlJc w:val="left"/>
       <w:pPr>
-        <w:ind w:left="5040" w:hanging="360"/>
+        <w:ind w:left="5760" w:hanging="360"/>
       </w:pPr>
       <w:rPr>
         <w:u w:val="none"/>
@@ -13845,7 +14013,7 @@
       <w:lvlText w:val="●"/>
       <w:lvlJc w:val="left"/>
       <w:pPr>
-        <w:ind w:left="5760" w:hanging="360"/>
+        <w:ind w:left="6480" w:hanging="360"/>
       </w:pPr>
       <w:rPr>
         <w:u w:val="none"/>
@@ -13857,7 +14025,7 @@
       <w:lvlText w:val="○"/>
       <w:lvlJc w:val="left"/>
       <w:pPr>
-        <w:ind w:left="6480" w:hanging="360"/>
+        <w:ind w:left="7200" w:hanging="360"/>
       </w:pPr>
       <w:rPr>
         <w:u w:val="none"/>
@@ -13869,117 +14037,7 @@
       <w:lvlText w:val="■"/>
       <w:lvlJc w:val="left"/>
       <w:pPr>
-        <w:ind w:left="7200" w:hanging="360"/>
-      </w:pPr>
-      <w:rPr>
-        <w:u w:val="none"/>
-      </w:rPr>
-    </w:lvl>
-  </w:abstractNum>
-  <w:abstractNum w:abstractNumId="16">
-    <w:lvl w:ilvl="0">
-      <w:start w:val="1"/>
-      <w:numFmt w:val="bullet"/>
-      <w:lvlText w:val="●"/>
-      <w:lvlJc w:val="left"/>
-      <w:pPr>
-        <w:ind w:left="2880" w:hanging="360"/>
-      </w:pPr>
-      <w:rPr>
-        <w:u w:val="none"/>
-      </w:rPr>
-    </w:lvl>
-    <w:lvl w:ilvl="1">
-      <w:start w:val="1"/>
-      <w:numFmt w:val="bullet"/>
-      <w:lvlText w:val="○"/>
-      <w:lvlJc w:val="left"/>
-      <w:pPr>
-        <w:ind w:left="3600" w:hanging="360"/>
-      </w:pPr>
-      <w:rPr>
-        <w:u w:val="none"/>
-      </w:rPr>
-    </w:lvl>
-    <w:lvl w:ilvl="2">
-      <w:start w:val="1"/>
-      <w:numFmt w:val="bullet"/>
-      <w:lvlText w:val="■"/>
-      <w:lvlJc w:val="left"/>
-      <w:pPr>
-        <w:ind w:left="4320" w:hanging="360"/>
-      </w:pPr>
-      <w:rPr>
-        <w:u w:val="none"/>
-      </w:rPr>
-    </w:lvl>
-    <w:lvl w:ilvl="3">
-      <w:start w:val="1"/>
-      <w:numFmt w:val="bullet"/>
-      <w:lvlText w:val="●"/>
-      <w:lvlJc w:val="left"/>
-      <w:pPr>
-        <w:ind w:left="5040" w:hanging="360"/>
-      </w:pPr>
-      <w:rPr>
-        <w:u w:val="none"/>
-      </w:rPr>
-    </w:lvl>
-    <w:lvl w:ilvl="4">
-      <w:start w:val="1"/>
-      <w:numFmt w:val="bullet"/>
-      <w:lvlText w:val="○"/>
-      <w:lvlJc w:val="left"/>
-      <w:pPr>
-        <w:ind w:left="5760" w:hanging="360"/>
-      </w:pPr>
-      <w:rPr>
-        <w:u w:val="none"/>
-      </w:rPr>
-    </w:lvl>
-    <w:lvl w:ilvl="5">
-      <w:start w:val="1"/>
-      <w:numFmt w:val="bullet"/>
-      <w:lvlText w:val="■"/>
-      <w:lvlJc w:val="left"/>
-      <w:pPr>
-        <w:ind w:left="6480" w:hanging="360"/>
-      </w:pPr>
-      <w:rPr>
-        <w:u w:val="none"/>
-      </w:rPr>
-    </w:lvl>
-    <w:lvl w:ilvl="6">
-      <w:start w:val="1"/>
-      <w:numFmt w:val="bullet"/>
-      <w:lvlText w:val="●"/>
-      <w:lvlJc w:val="left"/>
-      <w:pPr>
-        <w:ind w:left="7200" w:hanging="360"/>
-      </w:pPr>
-      <w:rPr>
-        <w:u w:val="none"/>
-      </w:rPr>
-    </w:lvl>
-    <w:lvl w:ilvl="7">
-      <w:start w:val="1"/>
-      <w:numFmt w:val="bullet"/>
-      <w:lvlText w:val="○"/>
-      <w:lvlJc w:val="left"/>
-      <w:pPr>
         <w:ind w:left="7920" w:hanging="360"/>
-      </w:pPr>
-      <w:rPr>
-        <w:u w:val="none"/>
-      </w:rPr>
-    </w:lvl>
-    <w:lvl w:ilvl="8">
-      <w:start w:val="1"/>
-      <w:numFmt w:val="bullet"/>
-      <w:lvlText w:val="■"/>
-      <w:lvlJc w:val="left"/>
-      <w:pPr>
-        <w:ind w:left="8640" w:hanging="360"/>
       </w:pPr>
       <w:rPr>
         <w:u w:val="none"/>
@@ -14030,9 +14088,6 @@
   </w:num>
   <w:num w:numId="15">
     <w:abstractNumId w:val="15"/>
-  </w:num>
-  <w:num w:numId="16">
-    <w:abstractNumId w:val="16"/>
   </w:num>
 </w:numbering>
 </file>

</xml_diff>